<commit_message>
Initial stego detector system commit
</commit_message>
<xml_diff>
--- a/3. Chapter 3 - Research Methodology/Chapter 3 - Research Methodology.docx
+++ b/3. Chapter 3 - Research Methodology/Chapter 3 - Research Methodology.docx
@@ -738,7 +738,25 @@
                 <w:noProof/>
                 <w:color w:val="auto"/>
               </w:rPr>
-              <w:t>3.3.2 Static Analysis Focus</w:t>
+              <w:t>3.3.2 Static Analysi</w:t>
+            </w:r>
+            <w:r>
+              <w:rPr>
+                <w:rStyle w:val="Hyperlink"/>
+                <w:rFonts w:ascii="Aptos Display" w:hAnsi="Aptos Display"/>
+                <w:noProof/>
+                <w:color w:val="auto"/>
+              </w:rPr>
+              <w:t>s</w:t>
+            </w:r>
+            <w:r>
+              <w:rPr>
+                <w:rStyle w:val="Hyperlink"/>
+                <w:rFonts w:ascii="Aptos Display" w:hAnsi="Aptos Display"/>
+                <w:noProof/>
+                <w:color w:val="auto"/>
+              </w:rPr>
+              <w:t xml:space="preserve"> Focus</w:t>
             </w:r>
             <w:r>
               <w:rPr>
@@ -1341,7 +1359,7 @@
                 <w:noProof/>
                 <w:webHidden/>
               </w:rPr>
-              <w:t>10</w:t>
+              <w:t>9</w:t>
             </w:r>
             <w:r>
               <w:rPr>
@@ -2229,7 +2247,7 @@
                 <w:noProof/>
                 <w:webHidden/>
               </w:rPr>
-              <w:t>14</w:t>
+              <w:t>13</w:t>
             </w:r>
             <w:r>
               <w:rPr>
@@ -2629,7 +2647,7 @@
                 <w:noProof/>
                 <w:webHidden/>
               </w:rPr>
-              <w:t>16</w:t>
+              <w:t>15</w:t>
             </w:r>
             <w:r>
               <w:rPr>
@@ -3029,7 +3047,7 @@
                 <w:noProof/>
                 <w:webHidden/>
               </w:rPr>
-              <w:t>18</w:t>
+              <w:t>17</w:t>
             </w:r>
             <w:r>
               <w:rPr>
@@ -3263,7 +3281,7 @@
                 <w:noProof/>
                 <w:webHidden/>
               </w:rPr>
-              <w:t>19</w:t>
+              <w:t>18</w:t>
             </w:r>
             <w:r>
               <w:rPr>
@@ -3507,7 +3525,7 @@
                 <w:noProof/>
                 <w:webHidden/>
               </w:rPr>
-              <w:t>20</w:t>
+              <w:t>19</w:t>
             </w:r>
             <w:r>
               <w:rPr>
@@ -3842,49 +3860,15 @@
           <w:sz w:val="24"/>
           <w:szCs w:val="24"/>
         </w:rPr>
-        <w:t xml:space="preserve">images and </w:t>
-      </w:r>
-      <w:proofErr w:type="spellStart"/>
-      <w:r>
-        <w:rPr>
-          <w:rFonts w:ascii="Aptos Display" w:hAnsi="Aptos Display"/>
-          <w:sz w:val="24"/>
-          <w:szCs w:val="24"/>
-        </w:rPr>
-        <w:t>stego</w:t>
-      </w:r>
-      <w:proofErr w:type="spellEnd"/>
-      <w:r>
-        <w:rPr>
-          <w:rFonts w:ascii="Aptos Display" w:hAnsi="Aptos Display"/>
-          <w:sz w:val="24"/>
-          <w:szCs w:val="24"/>
-        </w:rPr>
-        <w:t xml:space="preserve"> images generated through LSB-based embedding. </w:t>
-      </w:r>
-      <w:r>
-        <w:rPr>
-          <w:rFonts w:ascii="Aptos Display" w:hAnsi="Aptos Display"/>
-          <w:sz w:val="24"/>
-          <w:szCs w:val="24"/>
-        </w:rPr>
-        <w:t>The system does not run or open anything inside the image.</w:t>
-      </w:r>
-      <w:r>
-        <w:rPr>
-          <w:rFonts w:ascii="Aptos Display" w:hAnsi="Aptos Display"/>
-          <w:sz w:val="24"/>
-          <w:szCs w:val="24"/>
-        </w:rPr>
-        <w:t xml:space="preserve"> </w:t>
-      </w:r>
-      <w:r>
-        <w:rPr>
-          <w:rFonts w:ascii="Aptos Display" w:hAnsi="Aptos Display"/>
-          <w:sz w:val="24"/>
-          <w:szCs w:val="24"/>
-        </w:rPr>
-        <w:t>Instead, it examines the image’s raw bytes and extracted features to look for hidden or suspicious patterns before execution, making the analysis safe and non-invasive</w:t>
+        <w:t xml:space="preserve">images and stego images generated through LSB-based embedding. </w:t>
+      </w:r>
+      <w:r>
+        <w:rPr>
+          <w:rFonts w:ascii="Aptos Display" w:hAnsi="Aptos Display"/>
+          <w:sz w:val="24"/>
+          <w:szCs w:val="24"/>
+        </w:rPr>
+        <w:t>The system does not run or open anything inside the image. Instead, it examines the image’s raw bytes and extracted features to look for hidden or suspicious patterns before execution, making the analysis safe and non-invasive</w:t>
       </w:r>
       <w:r>
         <w:rPr>
@@ -3950,25 +3934,7 @@
           <w:sz w:val="24"/>
           <w:szCs w:val="24"/>
         </w:rPr>
-        <w:t xml:space="preserve">, and Section 3.6 details the steganographic sample generation process used to produce labelled </w:t>
-      </w:r>
-      <w:proofErr w:type="spellStart"/>
-      <w:r>
-        <w:rPr>
-          <w:rFonts w:ascii="Aptos Display" w:hAnsi="Aptos Display"/>
-          <w:sz w:val="24"/>
-          <w:szCs w:val="24"/>
-        </w:rPr>
-        <w:t>stego</w:t>
-      </w:r>
-      <w:proofErr w:type="spellEnd"/>
-      <w:r>
-        <w:rPr>
-          <w:rFonts w:ascii="Aptos Display" w:hAnsi="Aptos Display"/>
-          <w:sz w:val="24"/>
-          <w:szCs w:val="24"/>
-        </w:rPr>
-        <w:t xml:space="preserve"> images. </w:t>
+        <w:t xml:space="preserve">, and Section 3.6 details the steganographic sample generation process used to produce labelled stego images. </w:t>
       </w:r>
       <w:r>
         <w:rPr>
@@ -3984,7 +3950,23 @@
           <w:sz w:val="24"/>
           <w:szCs w:val="24"/>
         </w:rPr>
-        <w:t xml:space="preserve"> sections describe feature the YARA detection method, the anomaly detection method, and the hybrid fusion logic, before presenting the evaluation metrics, experimental procedure, tools and environment, and ethical and safety considerations. The chapter concludes with a summary that links the methodology to the system implementation presented in Chapter 4.</w:t>
+        <w:t xml:space="preserve"> sections </w:t>
+      </w:r>
+      <w:r>
+        <w:rPr>
+          <w:rFonts w:ascii="Aptos Display" w:hAnsi="Aptos Display"/>
+          <w:sz w:val="24"/>
+          <w:szCs w:val="24"/>
+        </w:rPr>
+        <w:t>describe the feature engineering process, the YARA detection method</w:t>
+      </w:r>
+      <w:r>
+        <w:rPr>
+          <w:rFonts w:ascii="Aptos Display" w:hAnsi="Aptos Display"/>
+          <w:sz w:val="24"/>
+          <w:szCs w:val="24"/>
+        </w:rPr>
+        <w:t>, the anomaly detection method, and the hybrid fusion logic, before presenting the evaluation metrics, experimental procedure, tools and environment, and ethical and safety considerations. The chapter concludes with a summary that links the methodology to the system implementation presented in Chapter 4.</w:t>
       </w:r>
     </w:p>
     <w:p>
@@ -4227,7 +4209,23 @@
           <w:sz w:val="24"/>
           <w:szCs w:val="24"/>
         </w:rPr>
-        <w:t>This study follows a quantitative and experimental research approach, where controlled datasets of benign and steganographic images are evaluated using measurable detection performance metrics, furthermore, t</w:t>
+        <w:t xml:space="preserve">This study follows a quantitative and experimental research approach, where controlled datasets of benign and steganographic images are evaluated using measurable detection performance metrics, </w:t>
+      </w:r>
+      <w:r>
+        <w:rPr>
+          <w:rFonts w:ascii="Aptos Display" w:hAnsi="Aptos Display"/>
+          <w:sz w:val="24"/>
+          <w:szCs w:val="24"/>
+        </w:rPr>
+        <w:t xml:space="preserve">and </w:t>
+      </w:r>
+      <w:r>
+        <w:rPr>
+          <w:rFonts w:ascii="Aptos Display" w:hAnsi="Aptos Display"/>
+          <w:sz w:val="24"/>
+          <w:szCs w:val="24"/>
+        </w:rPr>
+        <w:t>furthermore, t</w:t>
       </w:r>
       <w:r>
         <w:rPr>
@@ -4427,31 +4425,7 @@
           <w:sz w:val="24"/>
           <w:szCs w:val="24"/>
         </w:rPr>
-        <w:t xml:space="preserve"> </w:t>
-      </w:r>
-      <w:r>
-        <w:rPr>
-          <w:rFonts w:ascii="Aptos Display" w:hAnsi="Aptos Display"/>
-          <w:sz w:val="24"/>
-          <w:szCs w:val="24"/>
-        </w:rPr>
-        <w:t>detecti</w:t>
-      </w:r>
-      <w:r>
-        <w:rPr>
-          <w:rFonts w:ascii="Aptos Display" w:hAnsi="Aptos Display"/>
-          <w:sz w:val="24"/>
-          <w:szCs w:val="24"/>
-        </w:rPr>
-        <w:t>on of</w:t>
-      </w:r>
-      <w:r>
-        <w:rPr>
-          <w:rFonts w:ascii="Aptos Display" w:hAnsi="Aptos Display"/>
-          <w:sz w:val="24"/>
-          <w:szCs w:val="24"/>
-        </w:rPr>
-        <w:t xml:space="preserve"> steganographic malware can be measured objectively using metrics like accuracy, precision, recall, and error rates</w:t>
+        <w:t xml:space="preserve"> detection of steganographic malware can be measured objectively using metrics like accuracy, precision, recall, and error rates</w:t>
       </w:r>
       <w:r>
         <w:rPr>
@@ -4467,7 +4441,23 @@
           <w:sz w:val="24"/>
           <w:szCs w:val="24"/>
         </w:rPr>
-        <w:t>By testing the system on known clean images and images with hidden data, the study shows how different hiding techniques affect how well the detection performs.</w:t>
+        <w:t xml:space="preserve">By testing the system on known clean images and images with hidden data, the study shows </w:t>
+      </w:r>
+      <w:r>
+        <w:rPr>
+          <w:rFonts w:ascii="Aptos Display" w:hAnsi="Aptos Display"/>
+          <w:sz w:val="24"/>
+          <w:szCs w:val="24"/>
+        </w:rPr>
+        <w:t>how LSB embedding affects detection performance</w:t>
+      </w:r>
+      <w:r>
+        <w:rPr>
+          <w:rFonts w:ascii="Aptos Display" w:hAnsi="Aptos Display"/>
+          <w:sz w:val="24"/>
+          <w:szCs w:val="24"/>
+        </w:rPr>
+        <w:t>.</w:t>
       </w:r>
     </w:p>
     <w:p>
@@ -4580,6 +4570,14 @@
           <w:szCs w:val="24"/>
         </w:rPr>
         <w:t>Interpretivism views reality as socially constructed and shaped by human experiences, perceptions, and contextual understanding. Rather than seeking universal laws, interpretivist research aims to understand meaning, intent, and context, often relying on qualitative methods such as interviews, observations, and textual</w:t>
+      </w:r>
+      <w:r>
+        <w:rPr>
+          <w:rFonts w:ascii="Aptos Display" w:hAnsi="Aptos Display"/>
+          <w:sz w:val="24"/>
+          <w:szCs w:val="24"/>
+        </w:rPr>
+        <w:t xml:space="preserve"> analysis</w:t>
       </w:r>
       <w:r>
         <w:rPr>
@@ -5974,7 +5972,23 @@
           <w:sz w:val="24"/>
           <w:szCs w:val="24"/>
         </w:rPr>
-        <w:t>ummarise how the adopted research design aligns with common research paradigms.</w:t>
+        <w:t>ummarise</w:t>
+      </w:r>
+      <w:r>
+        <w:rPr>
+          <w:rFonts w:ascii="Aptos Display" w:hAnsi="Aptos Display"/>
+          <w:sz w:val="24"/>
+          <w:szCs w:val="24"/>
+        </w:rPr>
+        <w:t>s</w:t>
+      </w:r>
+      <w:r>
+        <w:rPr>
+          <w:rFonts w:ascii="Aptos Display" w:hAnsi="Aptos Display"/>
+          <w:sz w:val="24"/>
+          <w:szCs w:val="24"/>
+        </w:rPr>
+        <w:t xml:space="preserve"> how the adopted research design aligns with common research paradigms.</w:t>
       </w:r>
     </w:p>
     <w:p>
@@ -5992,15 +6006,7 @@
           <w:sz w:val="24"/>
           <w:szCs w:val="24"/>
         </w:rPr>
-        <w:t>As noted within this design, t</w:t>
-      </w:r>
-      <w:r>
-        <w:rPr>
-          <w:rFonts w:ascii="Aptos Display" w:hAnsi="Aptos Display"/>
-          <w:sz w:val="24"/>
-          <w:szCs w:val="24"/>
-        </w:rPr>
-        <w:t>he system is built and improved using Design Science, while its performance is tested objectively and in a repeatable way using measurable evidence. Interpretivism is excluded because the study does not depend on human opinions or subjective analysis.</w:t>
+        <w:t>As noted within this design, the system is built and improved using Design Science, while its performance is tested objectively and in a repeatable way using measurable evidence. Interpretivism is excluded because the study does not depend on human opinions or subjective analysis.</w:t>
       </w:r>
     </w:p>
     <w:p>
@@ -6031,14 +6037,7 @@
           <w:rFonts w:ascii="Aptos Display" w:hAnsi="Aptos Display"/>
           <w:color w:val="auto"/>
         </w:rPr>
-        <w:t xml:space="preserve"> and </w:t>
-      </w:r>
-      <w:r>
-        <w:rPr>
-          <w:rFonts w:ascii="Aptos Display" w:hAnsi="Aptos Display"/>
-          <w:color w:val="auto"/>
-        </w:rPr>
-        <w:t>Detection Perspective</w:t>
+        <w:t xml:space="preserve"> and Detection Perspective</w:t>
       </w:r>
       <w:bookmarkEnd w:id="7"/>
     </w:p>
@@ -6513,7 +6512,14 @@
           <w:rFonts w:ascii="Aptos Display" w:hAnsi="Aptos Display"/>
           <w:color w:val="auto"/>
         </w:rPr>
-        <w:t>3.4 Threat Model and Assumptions</w:t>
+        <w:t xml:space="preserve">3.4 </w:t>
+      </w:r>
+      <w:r>
+        <w:rPr>
+          <w:rFonts w:ascii="Aptos Display" w:hAnsi="Aptos Display"/>
+          <w:color w:val="auto"/>
+        </w:rPr>
+        <w:t>Threat Model and Assumptions</w:t>
       </w:r>
       <w:bookmarkEnd w:id="11"/>
     </w:p>
@@ -6693,74 +6699,6 @@
         </w:rPr>
         <w:t xml:space="preserve"> and embed payloads using spatial-domain steganography, particularly Least Significant Bit substitution. </w:t>
       </w:r>
-      <w:r>
-        <w:rPr>
-          <w:rFonts w:ascii="Aptos Display" w:hAnsi="Aptos Display"/>
-        </w:rPr>
-        <w:t>Some a</w:t>
-      </w:r>
-      <w:r>
-        <w:rPr>
-          <w:rFonts w:ascii="Aptos Display" w:hAnsi="Aptos Display"/>
-        </w:rPr>
-        <w:t>dvances in artificial intelligence</w:t>
-      </w:r>
-      <w:r>
-        <w:rPr>
-          <w:rFonts w:ascii="Aptos Display" w:hAnsi="Aptos Display"/>
-        </w:rPr>
-        <w:t xml:space="preserve"> can</w:t>
-      </w:r>
-      <w:r>
-        <w:rPr>
-          <w:rFonts w:ascii="Aptos Display" w:hAnsi="Aptos Display"/>
-        </w:rPr>
-        <w:t xml:space="preserve"> further enhance the attacker’s ability to automate and optimise steganographic embedding, producing images that remain </w:t>
-      </w:r>
-      <w:r>
-        <w:rPr>
-          <w:rFonts w:ascii="Aptos Display" w:hAnsi="Aptos Display"/>
-        </w:rPr>
-        <w:lastRenderedPageBreak/>
-        <w:t xml:space="preserve">visually indistinguishable from their originals while maintaining high evasion potential </w:t>
-      </w:r>
-      <w:r>
-        <w:rPr>
-          <w:rFonts w:ascii="Aptos Display" w:hAnsi="Aptos Display"/>
-        </w:rPr>
-        <w:fldChar w:fldCharType="begin"/>
-      </w:r>
-      <w:r>
-        <w:rPr>
-          <w:rFonts w:ascii="Aptos Display" w:hAnsi="Aptos Display"/>
-        </w:rPr>
-        <w:instrText xml:space="preserve"> ADDIN EN.CITE &lt;EndNote&gt;&lt;Cite&gt;&lt;Author&gt;Liu&lt;/Author&gt;&lt;Year&gt;2022&lt;/Year&gt;&lt;RecNum&gt;204&lt;/RecNum&gt;&lt;DisplayText&gt;(Liu et al., 2022)&lt;/DisplayText&gt;&lt;record&gt;&lt;rec-number&gt;204&lt;/rec-number&gt;&lt;foreign-keys&gt;&lt;key app="EN" db-id="wpsfper5z25dafer2vjpetstfzzrdwx2029e" timestamp="1770196832"&gt;204&lt;/key&gt;&lt;/foreign-keys&gt;&lt;ref-type name="Journal Article"&gt;17&lt;/ref-type&gt;&lt;contributors&gt;&lt;authors&gt;&lt;author&gt;Liu, Jinyuan&lt;/author&gt;&lt;author&gt;Wang, Yong&lt;/author&gt;&lt;author&gt;Han, Qi&lt;/author&gt;&lt;author&gt;Gao, Jerry&lt;/author&gt;&lt;/authors&gt;&lt;/contributors&gt;&lt;titles&gt;&lt;title&gt;A sensitive image encryption algorithm based on a higher-dimensional chaotic map and steganography&lt;/title&gt;&lt;secondary-title&gt;International Journal of Bifurcation and Chaos&lt;/secondary-title&gt;&lt;/titles&gt;&lt;periodical&gt;&lt;full-title&gt;International Journal of Bifurcation and Chaos&lt;/full-title&gt;&lt;/periodical&gt;&lt;pages&gt;2250004&lt;/pages&gt;&lt;volume&gt;32&lt;/volume&gt;&lt;number&gt;01&lt;/number&gt;&lt;dates&gt;&lt;year&gt;2022&lt;/year&gt;&lt;/dates&gt;&lt;isbn&gt;0218-1274&lt;/isbn&gt;&lt;urls&gt;&lt;/urls&gt;&lt;/record&gt;&lt;/Cite&gt;&lt;/EndNote&gt;</w:instrText>
-      </w:r>
-      <w:r>
-        <w:rPr>
-          <w:rFonts w:ascii="Aptos Display" w:hAnsi="Aptos Display"/>
-        </w:rPr>
-        <w:fldChar w:fldCharType="separate"/>
-      </w:r>
-      <w:r>
-        <w:rPr>
-          <w:rFonts w:ascii="Aptos Display" w:hAnsi="Aptos Display"/>
-          <w:noProof/>
-        </w:rPr>
-        <w:t>(Liu et al., 2022)</w:t>
-      </w:r>
-      <w:r>
-        <w:rPr>
-          <w:rFonts w:ascii="Aptos Display" w:hAnsi="Aptos Display"/>
-        </w:rPr>
-        <w:fldChar w:fldCharType="end"/>
-      </w:r>
-      <w:r>
-        <w:rPr>
-          <w:rFonts w:ascii="Aptos Display" w:hAnsi="Aptos Display"/>
-        </w:rPr>
-        <w:t>.</w:t>
-      </w:r>
     </w:p>
     <w:p>
       <w:pPr>
@@ -6774,6 +6712,7 @@
         <w:rPr>
           <w:rFonts w:ascii="Aptos Display" w:hAnsi="Aptos Display"/>
         </w:rPr>
+        <w:lastRenderedPageBreak/>
         <w:t>From the defender’s side, the study assumes a static analysis setup similar to many antivirus tools, where image files are examined before execution using inspection methods, without running or unpacking any hidden payloads</w:t>
       </w:r>
       <w:r>
@@ -6798,7 +6737,7 @@
         <w:rPr>
           <w:rFonts w:ascii="Aptos Display" w:hAnsi="Aptos Display"/>
         </w:rPr>
-        <w:instrText xml:space="preserve"> ADDIN EN.CITE &lt;EndNote&gt;&lt;Cite&gt;&lt;Author&gt;Amalan&lt;/Author&gt;&lt;RecNum&gt;205&lt;/RecNum&gt;&lt;DisplayText&gt;(Amalan)&lt;/DisplayText&gt;&lt;record&gt;&lt;rec-number&gt;205&lt;/rec-number&gt;&lt;foreign-keys&gt;&lt;key app="EN" db-id="wpsfper5z25dafer2vjpetstfzzrdwx2029e" timestamp="1770197531"&gt;205&lt;/key&gt;&lt;/foreign-keys&gt;&lt;ref-type name="Journal Article"&gt;17&lt;/ref-type&gt;&lt;contributors&gt;&lt;authors&gt;&lt;author&gt;Amalan, Akash&lt;/author&gt;&lt;/authors&gt;&lt;/contributors&gt;&lt;titles&gt;&lt;title&gt;Malware Evolution&lt;/title&gt;&lt;/titles&gt;&lt;dates&gt;&lt;/dates&gt;&lt;urls&gt;&lt;/urls&gt;&lt;/record&gt;&lt;/Cite&gt;&lt;/EndNote&gt;</w:instrText>
+        <w:instrText xml:space="preserve"> ADDIN EN.CITE &lt;EndNote&gt;&lt;Cite&gt;&lt;Author&gt;Greco&lt;/Author&gt;&lt;Year&gt;2025&lt;/Year&gt;&lt;RecNum&gt;213&lt;/RecNum&gt;&lt;DisplayText&gt;(Greco and Ianni, 2025)&lt;/DisplayText&gt;&lt;record&gt;&lt;rec-number&gt;213&lt;/rec-number&gt;&lt;foreign-keys&gt;&lt;key app="EN" db-id="wpsfper5z25dafer2vjpetstfzzrdwx2029e" timestamp="1770284401"&gt;213&lt;/key&gt;&lt;/foreign-keys&gt;&lt;ref-type name="Journal Article"&gt;17&lt;/ref-type&gt;&lt;contributors&gt;&lt;authors&gt;&lt;author&gt;Greco, Claudia&lt;/author&gt;&lt;author&gt;Ianni, Michele&lt;/author&gt;&lt;/authors&gt;&lt;/contributors&gt;&lt;titles&gt;&lt;title&gt;A cross-architecture malware detection approach based on intermediate representation&lt;/title&gt;&lt;secondary-title&gt;Journal of Information Security and Applications&lt;/secondary-title&gt;&lt;/titles&gt;&lt;periodical&gt;&lt;full-title&gt;Journal of Information Security and Applications&lt;/full-title&gt;&lt;/periodical&gt;&lt;pages&gt;104117&lt;/pages&gt;&lt;volume&gt;93&lt;/volume&gt;&lt;dates&gt;&lt;year&gt;2025&lt;/year&gt;&lt;/dates&gt;&lt;isbn&gt;2214-2126&lt;/isbn&gt;&lt;urls&gt;&lt;/urls&gt;&lt;/record&gt;&lt;/Cite&gt;&lt;/EndNote&gt;</w:instrText>
       </w:r>
       <w:r>
         <w:rPr>
@@ -6811,7 +6750,7 @@
           <w:rFonts w:ascii="Aptos Display" w:hAnsi="Aptos Display"/>
           <w:noProof/>
         </w:rPr>
-        <w:t>(Amalan)</w:t>
+        <w:t>(Greco and Ianni, 2025)</w:t>
       </w:r>
       <w:r>
         <w:rPr>
@@ -6906,13 +6845,7 @@
         <w:rPr>
           <w:rFonts w:ascii="Aptos Display" w:hAnsi="Aptos Display"/>
         </w:rPr>
-        <w:t>The study assumes malware is hidden in images using spatial-domain methods, mainly Least Significant Bit substitution. LSB is chosen because it is well known in research for hiding data without visibly changing the image, making the concealment hard to notice</w:t>
-      </w:r>
-      <w:r>
-        <w:rPr>
-          <w:rFonts w:ascii="Aptos Display" w:hAnsi="Aptos Display"/>
-        </w:rPr>
-        <w:t xml:space="preserve"> </w:t>
+        <w:t xml:space="preserve">The study assumes malware is hidden in images using spatial-domain methods, mainly Least Significant Bit substitution. LSB is chosen because it is well known in research for hiding data without visibly changing the image, making the concealment hard to notice </w:t>
       </w:r>
       <w:r>
         <w:rPr>
@@ -7143,8 +7076,14 @@
           <w:rFonts w:ascii="Aptos Display" w:hAnsi="Aptos Display"/>
           <w:color w:val="auto"/>
         </w:rPr>
-        <w:lastRenderedPageBreak/>
-        <w:t>3.5 Data Sources and Dataset Construction</w:t>
+        <w:t xml:space="preserve">3.5 </w:t>
+      </w:r>
+      <w:r>
+        <w:rPr>
+          <w:rFonts w:ascii="Aptos Display" w:hAnsi="Aptos Display"/>
+          <w:color w:val="auto"/>
+        </w:rPr>
+        <w:t>Data Sources and Dataset Construction</w:t>
       </w:r>
       <w:bookmarkEnd w:id="15"/>
     </w:p>
@@ -7166,7 +7105,14 @@
         <w:rPr>
           <w:rFonts w:ascii="Aptos Display" w:hAnsi="Aptos Display"/>
         </w:rPr>
-        <w:t>A carefully controlled dataset was needed so experiments could be repeated, labels would be reliable, and performance could be measured objectively. Instead of using external datasets, the study created its own dataset to fully control how data was embedded, what payloads looked like, and the testing conditions</w:t>
+        <w:t xml:space="preserve">A carefully controlled dataset was needed so experiments could be repeated, labels would </w:t>
+      </w:r>
+      <w:r>
+        <w:rPr>
+          <w:rFonts w:ascii="Aptos Display" w:hAnsi="Aptos Display"/>
+        </w:rPr>
+        <w:lastRenderedPageBreak/>
+        <w:t>be reliable, and performance could be measured objectively. Instead of using external datasets, the study created its own dataset to fully control how data was embedded, what payloads looked like, and the testing conditions</w:t>
       </w:r>
       <w:r>
         <w:rPr>
@@ -7232,7 +7178,7 @@
           <w:b/>
           <w:bCs/>
         </w:rPr>
-        <w:t xml:space="preserve"> (</w:t>
+        <w:t xml:space="preserve"> (Original</w:t>
       </w:r>
       <w:r>
         <w:rPr>
@@ -7240,15 +7186,41 @@
           <w:b/>
           <w:bCs/>
         </w:rPr>
-        <w:t>Original</w:t>
-      </w:r>
-      <w:r>
+        <w:t>) Images</w:t>
+      </w:r>
+    </w:p>
+    <w:p>
+      <w:pPr>
+        <w:pStyle w:val="NormalWeb"/>
+        <w:jc w:val="both"/>
+        <w:rPr>
+          <w:rFonts w:ascii="Aptos Display" w:hAnsi="Aptos Display"/>
+        </w:rPr>
+      </w:pPr>
+      <w:r>
+        <w:rPr>
+          <w:rFonts w:ascii="Aptos Display" w:hAnsi="Aptos Display"/>
+        </w:rPr>
+        <w:t>Original images represent clean, non-malicious input files. These images serve as the baseline against which steganographic modifications are evaluated. Original images are uploaded into the system and stored without any embedded payloads. They are labelled as benign and used for training and evaluation of detection techniques, particularly for establishing normal statistical patterns during anomaly detection.</w:t>
+      </w:r>
+    </w:p>
+    <w:p>
+      <w:pPr>
+        <w:pStyle w:val="NormalWeb"/>
+        <w:jc w:val="both"/>
         <w:rPr>
           <w:rFonts w:ascii="Aptos Display" w:hAnsi="Aptos Display"/>
           <w:b/>
           <w:bCs/>
         </w:rPr>
-        <w:t>) Images</w:t>
+      </w:pPr>
+      <w:r>
+        <w:rPr>
+          <w:rFonts w:ascii="Aptos Display" w:hAnsi="Aptos Display"/>
+          <w:b/>
+          <w:bCs/>
+        </w:rPr>
+        <w:t>Stego (Malicious) Images</w:t>
       </w:r>
     </w:p>
     <w:p>
@@ -7263,73 +7235,19 @@
         <w:rPr>
           <w:rFonts w:ascii="Aptos Display" w:hAnsi="Aptos Display"/>
         </w:rPr>
-        <w:t>Original images represent clean, non-malicious input files. These images serve as the baseline against which steganographic modifications are evaluated. Original images are uploaded into the system and stored without any embedded payloads. They are labelled as benign and used for training and evaluation of detection techniques, particularly for establishing normal statistical patterns during anomaly detection.</w:t>
-      </w:r>
-    </w:p>
-    <w:p>
-      <w:pPr>
-        <w:pStyle w:val="NormalWeb"/>
-        <w:jc w:val="both"/>
-        <w:rPr>
-          <w:rFonts w:ascii="Aptos Display" w:hAnsi="Aptos Display"/>
-          <w:b/>
-          <w:bCs/>
-        </w:rPr>
-      </w:pPr>
-      <w:proofErr w:type="spellStart"/>
-      <w:r>
-        <w:rPr>
-          <w:rFonts w:ascii="Aptos Display" w:hAnsi="Aptos Display"/>
-          <w:b/>
-          <w:bCs/>
-        </w:rPr>
-        <w:t>Stego</w:t>
-      </w:r>
-      <w:proofErr w:type="spellEnd"/>
-      <w:r>
-        <w:rPr>
-          <w:rFonts w:ascii="Aptos Display" w:hAnsi="Aptos Display"/>
-          <w:b/>
-          <w:bCs/>
-        </w:rPr>
-        <w:t xml:space="preserve"> (Malicious) Images</w:t>
-      </w:r>
-    </w:p>
-    <w:p>
-      <w:pPr>
-        <w:pStyle w:val="NormalWeb"/>
-        <w:jc w:val="both"/>
-        <w:rPr>
-          <w:rFonts w:ascii="Aptos Display" w:hAnsi="Aptos Display"/>
-        </w:rPr>
-      </w:pPr>
-      <w:proofErr w:type="spellStart"/>
-      <w:r>
-        <w:rPr>
-          <w:rFonts w:ascii="Aptos Display" w:hAnsi="Aptos Display"/>
-        </w:rPr>
-        <w:t>Stego</w:t>
-      </w:r>
-      <w:proofErr w:type="spellEnd"/>
-      <w:r>
-        <w:rPr>
-          <w:rFonts w:ascii="Aptos Display" w:hAnsi="Aptos Display"/>
-        </w:rPr>
-        <w:t xml:space="preserve"> images are generated from the original images by embedding payload data using Least Significant Bit substitution. These images simulate steganographic malware carriers and are labelled as malicious. Each </w:t>
-      </w:r>
-      <w:proofErr w:type="spellStart"/>
-      <w:r>
-        <w:rPr>
-          <w:rFonts w:ascii="Aptos Display" w:hAnsi="Aptos Display"/>
-        </w:rPr>
-        <w:t>stego</w:t>
-      </w:r>
-      <w:proofErr w:type="spellEnd"/>
-      <w:r>
-        <w:rPr>
-          <w:rFonts w:ascii="Aptos Display" w:hAnsi="Aptos Display"/>
-        </w:rPr>
-        <w:t xml:space="preserve"> image is explicitly linked to its corresponding original image, ensuring traceability and enabling controlled comparison between benign and modified files.</w:t>
+        <w:t xml:space="preserve">Stego images are generated from the original images by embedding payload data using Least Significant Bit substitution. These images simulate steganographic malware carriers and are </w:t>
+      </w:r>
+      <w:r>
+        <w:rPr>
+          <w:rFonts w:ascii="Aptos Display" w:hAnsi="Aptos Display"/>
+        </w:rPr>
+        <w:t>labelled as simulated malicious carriers</w:t>
+      </w:r>
+      <w:r>
+        <w:rPr>
+          <w:rFonts w:ascii="Aptos Display" w:hAnsi="Aptos Display"/>
+        </w:rPr>
+        <w:t>. Each stego image is explicitly linked to its corresponding original image, ensuring traceability and enabling controlled comparison between benign and modified files.</w:t>
       </w:r>
     </w:p>
     <w:p>
@@ -7411,27 +7329,7 @@
         <w:rPr>
           <w:rFonts w:ascii="Aptos Display" w:hAnsi="Aptos Display"/>
         </w:rPr>
-        <w:t xml:space="preserve"> </w:t>
-      </w:r>
-      <w:r>
-        <w:rPr>
-          <w:rFonts w:ascii="Aptos Display" w:hAnsi="Aptos Display"/>
-        </w:rPr>
-        <w:t xml:space="preserve">Image size and resolution were limited so there was enough space to hide data while keeping </w:t>
-      </w:r>
-      <w:proofErr w:type="spellStart"/>
-      <w:r>
-        <w:rPr>
-          <w:rFonts w:ascii="Aptos Display" w:hAnsi="Aptos Display"/>
-        </w:rPr>
-        <w:t>stego</w:t>
-      </w:r>
-      <w:proofErr w:type="spellEnd"/>
-      <w:r>
-        <w:rPr>
-          <w:rFonts w:ascii="Aptos Display" w:hAnsi="Aptos Display"/>
-        </w:rPr>
-        <w:t xml:space="preserve"> images visually similar to the originals. This also helps keep feature extraction consistent and avoids issues caused by very small or very large images.</w:t>
+        <w:t xml:space="preserve"> Image size and resolution were limited so there was enough space to hide data while keeping stego images visually similar to the originals. This also helps keep feature extraction consistent and avoids issues caused by very small or very large images.</w:t>
       </w:r>
     </w:p>
     <w:p>
@@ -7464,21 +7362,7 @@
         <w:rPr>
           <w:rFonts w:ascii="Aptos Display" w:hAnsi="Aptos Display"/>
         </w:rPr>
-        <w:t xml:space="preserve">Payloads embedded within </w:t>
-      </w:r>
-      <w:proofErr w:type="spellStart"/>
-      <w:r>
-        <w:rPr>
-          <w:rFonts w:ascii="Aptos Display" w:hAnsi="Aptos Display"/>
-        </w:rPr>
-        <w:t>stego</w:t>
-      </w:r>
-      <w:proofErr w:type="spellEnd"/>
-      <w:r>
-        <w:rPr>
-          <w:rFonts w:ascii="Aptos Display" w:hAnsi="Aptos Display"/>
-        </w:rPr>
-        <w:t xml:space="preserve"> images are AI-generated, non-executable data sequences to ensure ethical, safe, and controlled experimentation. </w:t>
+        <w:t xml:space="preserve">Payloads embedded within stego images are AI-generated, non-executable data sequences to ensure ethical, safe, and controlled experimentation. </w:t>
       </w:r>
     </w:p>
     <w:p>
@@ -7493,7 +7377,6 @@
         <w:rPr>
           <w:rFonts w:ascii="Aptos Display" w:hAnsi="Aptos Display"/>
         </w:rPr>
-        <w:lastRenderedPageBreak/>
         <w:t>The study utilises</w:t>
       </w:r>
       <w:r>
@@ -7527,13 +7410,13 @@
           <w:b/>
           <w:bCs/>
         </w:rPr>
-        <w:t>AI-generated text and byte-like payloads</w:t>
-      </w:r>
-      <w:r>
-        <w:rPr>
-          <w:rFonts w:ascii="Aptos Display" w:hAnsi="Aptos Display"/>
-        </w:rPr>
-        <w:t>, produced to simulate realistic, previously unseen content patterns that may be embedded by automated or intelligent malware generation techniques</w:t>
+        <w:t xml:space="preserve">AI-generated text and byte-like payloads, </w:t>
+      </w:r>
+      <w:r>
+        <w:rPr>
+          <w:rFonts w:ascii="Aptos Display" w:hAnsi="Aptos Display"/>
+        </w:rPr>
+        <w:t>produced to simulate diverse and previously unseen content patterns for controlled steganographic detection evaluation</w:t>
       </w:r>
     </w:p>
     <w:p>
@@ -7552,43 +7435,14 @@
         <w:rPr>
           <w:rFonts w:ascii="Aptos Display" w:hAnsi="Aptos Display"/>
         </w:rPr>
-        <w:t xml:space="preserve">The </w:t>
-      </w:r>
-      <w:r>
-        <w:rPr>
-          <w:rFonts w:ascii="Aptos Display" w:hAnsi="Aptos Display"/>
-          <w:b/>
-          <w:bCs/>
-        </w:rPr>
-        <w:t>EICAR test string</w:t>
-      </w:r>
-      <w:r>
-        <w:rPr>
-          <w:rFonts w:ascii="Aptos Display" w:hAnsi="Aptos Display"/>
-          <w:b/>
-          <w:bCs/>
-        </w:rPr>
-        <w:t xml:space="preserve"> and</w:t>
-      </w:r>
-      <w:r>
-        <w:rPr>
-          <w:rFonts w:ascii="Aptos Display" w:hAnsi="Aptos Display"/>
-        </w:rPr>
-        <w:t xml:space="preserve"> </w:t>
-      </w:r>
-      <w:r>
-        <w:rPr>
-          <w:rFonts w:ascii="Aptos Display" w:hAnsi="Aptos Display"/>
-          <w:b/>
-          <w:bCs/>
-        </w:rPr>
-        <w:t>Randomised AI-generated sequences</w:t>
-      </w:r>
-      <w:r>
-        <w:rPr>
-          <w:rFonts w:ascii="Aptos Display" w:hAnsi="Aptos Display"/>
-        </w:rPr>
-        <w:t>, used to model variability and unpredictability commonly associated with adaptive or evolving steganographic malware</w:t>
+        <w:lastRenderedPageBreak/>
+        <w:t>The EICAR antivirus test string is used as a standard test payload, alongside additional AI-generated synthetic payload sequences</w:t>
+      </w:r>
+      <w:r>
+        <w:rPr>
+          <w:rFonts w:ascii="Aptos Display" w:hAnsi="Aptos Display"/>
+        </w:rPr>
+        <w:t>.</w:t>
       </w:r>
     </w:p>
     <w:p>
@@ -7642,22 +7496,8 @@
         <w:rPr>
           <w:rFonts w:ascii="Aptos Display" w:hAnsi="Aptos Display"/>
         </w:rPr>
-        <w:t>Labels are assigned upfront when the dataset is created. Clean images are marked benign, and images with embedded payloads are marked</w:t>
-      </w:r>
-      <w:r>
-        <w:rPr>
-          <w:rFonts w:ascii="Aptos Display" w:hAnsi="Aptos Display"/>
-        </w:rPr>
-        <w:t xml:space="preserve"> </w:t>
-      </w:r>
-      <w:proofErr w:type="spellStart"/>
-      <w:r>
-        <w:rPr>
-          <w:rFonts w:ascii="Aptos Display" w:hAnsi="Aptos Display"/>
-        </w:rPr>
-        <w:t>stego</w:t>
-      </w:r>
-      <w:proofErr w:type="spellEnd"/>
+        <w:t>Labels are assigned upfront when the dataset is created. Clean images are marked benign, and images with embedded payloads are marked stego</w:t>
+      </w:r>
       <w:r>
         <w:rPr>
           <w:rFonts w:ascii="Aptos Display" w:hAnsi="Aptos Display"/>
@@ -7670,31 +7510,7 @@
         <w:rPr>
           <w:rFonts w:ascii="Aptos Display" w:hAnsi="Aptos Display"/>
         </w:rPr>
-        <w:t>The</w:t>
-      </w:r>
-      <w:r>
-        <w:rPr>
-          <w:rFonts w:ascii="Aptos Display" w:hAnsi="Aptos Display"/>
-        </w:rPr>
-        <w:t xml:space="preserve"> </w:t>
-      </w:r>
-      <w:r>
-        <w:rPr>
-          <w:rFonts w:ascii="Aptos Display" w:hAnsi="Aptos Display"/>
-        </w:rPr>
-        <w:t>system does not guess these labels during detection.</w:t>
-      </w:r>
-      <w:r>
-        <w:rPr>
-          <w:rFonts w:ascii="Aptos Display" w:hAnsi="Aptos Display"/>
-        </w:rPr>
-        <w:t xml:space="preserve"> </w:t>
-      </w:r>
-      <w:r>
-        <w:rPr>
-          <w:rFonts w:ascii="Aptos Display" w:hAnsi="Aptos Display"/>
-        </w:rPr>
-        <w:t>This makes performance evaluation objective and reliable, allowing metrics like accuracy, precision, recall, and error rates to be calculated correctly.</w:t>
+        <w:t>The system does not guess these labels during detection. This makes performance evaluation objective and reliable, allowing metrics like accuracy, precision, recall, and error rates to be calculated correctly.</w:t>
       </w:r>
     </w:p>
     <w:p>
@@ -7862,7 +7678,13 @@
         <w:rPr>
           <w:rFonts w:ascii="Aptos Display" w:hAnsi="Aptos Display"/>
         </w:rPr>
-        <w:t xml:space="preserve"> as explained in the previous chapter the literature review</w:t>
+        <w:t xml:space="preserve"> </w:t>
+      </w:r>
+      <w:r>
+        <w:rPr>
+          <w:rFonts w:ascii="Aptos Display" w:hAnsi="Aptos Display"/>
+        </w:rPr>
+        <w:t>as explained in the previous chapter (Literature Review)</w:t>
       </w:r>
       <w:r>
         <w:rPr>
@@ -7883,7 +7705,6 @@
         <w:rPr>
           <w:rFonts w:ascii="Aptos Display" w:hAnsi="Aptos Display"/>
         </w:rPr>
-        <w:lastRenderedPageBreak/>
         <w:t>Payloads embedded within images are non-executable</w:t>
       </w:r>
       <w:r>
@@ -7896,7 +7717,19 @@
         <w:rPr>
           <w:rFonts w:ascii="Aptos Display" w:hAnsi="Aptos Display"/>
         </w:rPr>
-        <w:t>, including the EICAR test string and randomly generated byte strings used to simulate unknown payload patterns. Payload generation is deterministic and controlled to ensure repeatability across experiments</w:t>
+        <w:t xml:space="preserve">, including </w:t>
+      </w:r>
+      <w:r>
+        <w:rPr>
+          <w:rFonts w:ascii="Aptos Display" w:hAnsi="Aptos Display"/>
+        </w:rPr>
+        <w:t>AI-generated and controlled synthetic byte strings</w:t>
+      </w:r>
+      <w:r>
+        <w:rPr>
+          <w:rFonts w:ascii="Aptos Display" w:hAnsi="Aptos Display"/>
+        </w:rPr>
+        <w:t xml:space="preserve"> used to simulate unknown payload patterns. Payload generation is deterministic and controlled to ensure repeatability across experiments</w:t>
       </w:r>
       <w:r>
         <w:rPr>
@@ -7917,7 +7750,14 @@
         <w:rPr>
           <w:rFonts w:ascii="Aptos Display" w:hAnsi="Aptos Display"/>
         </w:rPr>
-        <w:t>The study does not consider other hiding methods like EXIF metadata changes, appending data to files, or abusing PNG file chunks. These methods usually create file-structure anomalies instead of changing pixel data. Since the detection system focuses on pixel-level steganography, those techniques are intentionally left out</w:t>
+        <w:t xml:space="preserve">The study does not consider other hiding methods like EXIF metadata changes, appending data to files, or abusing PNG file chunks. These methods usually create file-structure </w:t>
+      </w:r>
+      <w:r>
+        <w:rPr>
+          <w:rFonts w:ascii="Aptos Display" w:hAnsi="Aptos Display"/>
+        </w:rPr>
+        <w:lastRenderedPageBreak/>
+        <w:t>anomalies instead of changing pixel data. Since the detection system focuses on pixel-level steganography, those techniques are intentionally left out</w:t>
       </w:r>
       <w:r>
         <w:rPr>
@@ -8118,10 +7958,16 @@
       <w:r>
         <w:rPr>
           <w:rFonts w:ascii="Aptos Display" w:hAnsi="Aptos Display"/>
+        </w:rPr>
+        <w:t>signature-based detection</w:t>
+      </w:r>
+      <w:r>
+        <w:rPr>
+          <w:rFonts w:ascii="Aptos Display" w:hAnsi="Aptos Display"/>
           <w:b/>
           <w:bCs/>
         </w:rPr>
-        <w:t xml:space="preserve">signature-based detection </w:t>
+        <w:t xml:space="preserve"> </w:t>
       </w:r>
       <w:r>
         <w:rPr>
@@ -8184,19 +8030,34 @@
         <w:rPr>
           <w:rFonts w:ascii="Aptos Display" w:hAnsi="Aptos Display"/>
         </w:rPr>
+        <w:t xml:space="preserve"> than overly general patterns</w:t>
+      </w:r>
+      <w:r>
+        <w:rPr>
+          <w:rFonts w:ascii="Aptos Display" w:hAnsi="Aptos Display"/>
+        </w:rPr>
+        <w:t>.</w:t>
+      </w:r>
+      <w:r>
+        <w:rPr>
+          <w:rFonts w:asciiTheme="minorHAnsi" w:eastAsiaTheme="minorEastAsia" w:hAnsiTheme="minorHAnsi" w:cstheme="minorBidi"/>
+          <w:sz w:val="22"/>
+          <w:szCs w:val="22"/>
+          <w:lang w:eastAsia="en-US"/>
+        </w:rPr>
         <w:t xml:space="preserve"> </w:t>
       </w:r>
       <w:r>
         <w:rPr>
           <w:rFonts w:ascii="Aptos Display" w:hAnsi="Aptos Display"/>
         </w:rPr>
-        <w:t>than overly general patterns</w:t>
-      </w:r>
-      <w:r>
-        <w:rPr>
-          <w:rFonts w:ascii="Aptos Display" w:hAnsi="Aptos Display"/>
-        </w:rPr>
-        <w:t>. The rules focus on detecting known string patterns, including test payload indicators, that may remain identifiable even when fragmented across image data. Rule execution is performed directly on image byte streams during scanning, without extracting or executing embedded content.</w:t>
+        <w:t>The rules focus on detecting known string patterns where identifiable indicators remain present; however, purely LSB-based embedding is expected to significantly reduce direct signature visibility</w:t>
+      </w:r>
+      <w:r>
+        <w:rPr>
+          <w:rFonts w:ascii="Aptos Display" w:hAnsi="Aptos Display"/>
+        </w:rPr>
+        <w:t>.</w:t>
       </w:r>
     </w:p>
     <w:p>
@@ -8211,22 +8072,7 @@
         <w:rPr>
           <w:rFonts w:ascii="Aptos Display" w:hAnsi="Aptos Display"/>
         </w:rPr>
-        <w:lastRenderedPageBreak/>
-        <w:t xml:space="preserve">While YARA provides fast and interpretable detection for known indicators, it has inherent limitations when applied to LSB steganographic images. As a result, YARA is expected to exhibit limited detection capability for purely LSB-based </w:t>
-      </w:r>
-      <w:proofErr w:type="spellStart"/>
-      <w:r>
-        <w:rPr>
-          <w:rFonts w:ascii="Aptos Display" w:hAnsi="Aptos Display"/>
-        </w:rPr>
-        <w:t>stego</w:t>
-      </w:r>
-      <w:proofErr w:type="spellEnd"/>
-      <w:r>
-        <w:rPr>
-          <w:rFonts w:ascii="Aptos Display" w:hAnsi="Aptos Display"/>
-        </w:rPr>
-        <w:t xml:space="preserve"> images, reinforcing the need for complementary anomaly-based detection.</w:t>
+        <w:t>While YARA provides fast and interpretable detection for known indicators, it has inherent limitations when applied to LSB steganographic images. As a result, YARA is expected to exhibit limited detection capability for purely LSB-based stego images, reinforcing the need for complementary anomaly-based detection.</w:t>
       </w:r>
     </w:p>
     <w:p>
@@ -8243,6 +8089,7 @@
           <w:rFonts w:ascii="Aptos Display" w:hAnsi="Aptos Display"/>
           <w:color w:val="auto"/>
         </w:rPr>
+        <w:lastRenderedPageBreak/>
         <w:t>3.9 Machine Learning–Based Anomaly Detection Methodology</w:t>
       </w:r>
       <w:bookmarkEnd w:id="24"/>
@@ -8377,7 +8224,19 @@
         <w:rPr>
           <w:rFonts w:ascii="Aptos Display" w:hAnsi="Aptos Display"/>
         </w:rPr>
-        <w:t>Compared to supervised classifiers, this approach does not require extensive labelled datasets and is better suited to detecting previously unseen steganographic patterns, making it appropriate for the study’s objectives.</w:t>
+        <w:t xml:space="preserve">Compared to supervised classifiers, this approach does not require extensive labelled datasets and is </w:t>
+      </w:r>
+      <w:r>
+        <w:rPr>
+          <w:rFonts w:ascii="Aptos Display" w:hAnsi="Aptos Display"/>
+        </w:rPr>
+        <w:t>better suited to identifying statistical deviations consistent with previously unseen steganographic patterns</w:t>
+      </w:r>
+      <w:r>
+        <w:rPr>
+          <w:rFonts w:ascii="Aptos Display" w:hAnsi="Aptos Display"/>
+        </w:rPr>
+        <w:t>, making it appropriate for the study’s objectives.</w:t>
       </w:r>
     </w:p>
     <w:p>
@@ -8457,7 +8316,6 @@
           <w:rFonts w:ascii="Aptos Display" w:hAnsi="Aptos Display"/>
           <w:color w:val="auto"/>
         </w:rPr>
-        <w:lastRenderedPageBreak/>
         <w:t>3.11 Evaluation Metrics and Performance Criteria</w:t>
       </w:r>
       <w:bookmarkEnd w:id="26"/>
@@ -8506,7 +8364,14 @@
         <w:rPr>
           <w:rFonts w:ascii="Aptos Display" w:hAnsi="Aptos Display"/>
         </w:rPr>
-        <w:t xml:space="preserve"> overall classification correctness, while precision and recall assess detection reliability and sensitivity, respectively. False positive rate and false negative rate are used to evaluate misclassification behaviour, which is particularly important in security-sensitive contexts.</w:t>
+        <w:t xml:space="preserve"> overall classification correctness, while precision and recall assess detection reliability and sensitivity, respectively. False positive rate and false negative rate </w:t>
+      </w:r>
+      <w:r>
+        <w:rPr>
+          <w:rFonts w:ascii="Aptos Display" w:hAnsi="Aptos Display"/>
+        </w:rPr>
+        <w:lastRenderedPageBreak/>
+        <w:t>are used to evaluate misclassification behaviour, which is particularly important in security-sensitive contexts.</w:t>
       </w:r>
     </w:p>
     <w:p>
@@ -8569,21 +8434,7 @@
         <w:rPr>
           <w:rFonts w:ascii="Aptos Display" w:hAnsi="Aptos Display"/>
         </w:rPr>
-        <w:t xml:space="preserve">The experimental procedure follows a fixed and repeatable workflow. A scan workspace is initialised, after which images are uploaded into the system. For </w:t>
-      </w:r>
-      <w:proofErr w:type="spellStart"/>
-      <w:r>
-        <w:rPr>
-          <w:rFonts w:ascii="Aptos Display" w:hAnsi="Aptos Display"/>
-        </w:rPr>
-        <w:t>stego</w:t>
-      </w:r>
-      <w:proofErr w:type="spellEnd"/>
-      <w:r>
-        <w:rPr>
-          <w:rFonts w:ascii="Aptos Display" w:hAnsi="Aptos Display"/>
-        </w:rPr>
-        <w:t xml:space="preserve"> samples, payload embedding is performed prior to detection.</w:t>
+        <w:t>The experimental procedure follows a fixed and repeatable workflow. A scan workspace is initialised, after which images are uploaded into the system. For stego samples, payload embedding is performed prior to detection.</w:t>
       </w:r>
     </w:p>
     <w:p>
@@ -9064,14 +8915,7 @@
         <w:rPr>
           <w:rFonts w:ascii="Aptos Display" w:hAnsi="Aptos Display"/>
         </w:rPr>
-        <w:t xml:space="preserve">This section describes the tools, technologies, and execution environment used to design, implement, and evaluate the proposed steganographic malware detection system. The selected tools support static analysis, controlled experimentation, and reproducible evaluation of detection performance. All technologies employed in this study were chosen </w:t>
-      </w:r>
-      <w:r>
-        <w:rPr>
-          <w:rFonts w:ascii="Aptos Display" w:hAnsi="Aptos Display"/>
-        </w:rPr>
-        <w:lastRenderedPageBreak/>
-        <w:t>based on their suitability for image-based malware analysis, integration capability, and alignment with real-world antivirus scanning scenarios.</w:t>
+        <w:t>This section describes the tools, technologies, and execution environment used to design, implement, and evaluate the proposed steganographic malware detection system. The selected tools support static analysis, controlled experimentation, and reproducible evaluation of detection performance. All technologies employed in this study were chosen based on their suitability for image-based malware analysis, integration capability, and alignment with real-world antivirus scanning scenarios.</w:t>
       </w:r>
     </w:p>
     <w:p>
@@ -9088,6 +8932,7 @@
           <w:rFonts w:ascii="Aptos Display" w:hAnsi="Aptos Display"/>
           <w:color w:val="auto"/>
         </w:rPr>
+        <w:lastRenderedPageBreak/>
         <w:t>3.13.1 Software Tools</w:t>
       </w:r>
       <w:bookmarkEnd w:id="29"/>
@@ -9135,7 +8980,6 @@
         </w:rPr>
         <w:t xml:space="preserve">The backend detection service was implemented using </w:t>
       </w:r>
-      <w:proofErr w:type="spellStart"/>
       <w:r>
         <w:rPr>
           <w:rFonts w:ascii="Aptos Display" w:hAnsi="Aptos Display"/>
@@ -9144,26 +8988,11 @@
         </w:rPr>
         <w:t>FastAPI</w:t>
       </w:r>
-      <w:proofErr w:type="spellEnd"/>
-      <w:r>
-        <w:rPr>
-          <w:rFonts w:ascii="Aptos Display" w:hAnsi="Aptos Display"/>
-        </w:rPr>
-        <w:t xml:space="preserve">, a modern Python web framework. </w:t>
-      </w:r>
-      <w:proofErr w:type="spellStart"/>
-      <w:r>
-        <w:rPr>
-          <w:rFonts w:ascii="Aptos Display" w:hAnsi="Aptos Display"/>
-        </w:rPr>
-        <w:t>FastAPI</w:t>
-      </w:r>
-      <w:proofErr w:type="spellEnd"/>
-      <w:r>
-        <w:rPr>
-          <w:rFonts w:ascii="Aptos Display" w:hAnsi="Aptos Display"/>
-        </w:rPr>
-        <w:t xml:space="preserve"> was used to expose RESTful endpoints for image upload, steganographic embedding, scanning, and result retrieval. Its asynchronous execution model and lightweight design make it suitable for handling concurrent scan requests during experimentation.</w:t>
+      <w:r>
+        <w:rPr>
+          <w:rFonts w:ascii="Aptos Display" w:hAnsi="Aptos Display"/>
+        </w:rPr>
+        <w:t>, a modern Python web framework. FastAPI was used to expose RESTful endpoints for image upload, steganographic embedding, scanning, and result retrieval. Its asynchronous execution model and lightweight design make it suitable for handling concurrent scan requests during experimentation.</w:t>
       </w:r>
     </w:p>
     <w:p>
@@ -9258,25 +9087,7 @@
           <w:b/>
           <w:bCs/>
         </w:rPr>
-        <w:t>YARA (</w:t>
-      </w:r>
-      <w:proofErr w:type="spellStart"/>
-      <w:r>
-        <w:rPr>
-          <w:rFonts w:ascii="Aptos Display" w:hAnsi="Aptos Display"/>
-          <w:b/>
-          <w:bCs/>
-        </w:rPr>
-        <w:t>yara</w:t>
-      </w:r>
-      <w:proofErr w:type="spellEnd"/>
-      <w:r>
-        <w:rPr>
-          <w:rFonts w:ascii="Aptos Display" w:hAnsi="Aptos Display"/>
-          <w:b/>
-          <w:bCs/>
-        </w:rPr>
-        <w:t>-python)</w:t>
+        <w:t>YARA (yara-python)</w:t>
       </w:r>
       <w:r>
         <w:rPr>
@@ -9378,7 +9189,6 @@
           <w:rFonts w:ascii="Aptos Display" w:hAnsi="Aptos Display"/>
         </w:rPr>
       </w:pPr>
-      <w:proofErr w:type="spellStart"/>
       <w:r>
         <w:rPr>
           <w:rFonts w:ascii="Aptos Display" w:hAnsi="Aptos Display"/>
@@ -9387,7 +9197,6 @@
         </w:rPr>
         <w:t>joblib</w:t>
       </w:r>
-      <w:proofErr w:type="spellEnd"/>
       <w:r>
         <w:rPr>
           <w:rFonts w:ascii="Aptos Display" w:hAnsi="Aptos Display"/>
@@ -9424,7 +9233,6 @@
           <w:rFonts w:ascii="Aptos Display" w:hAnsi="Aptos Display"/>
           <w:color w:val="auto"/>
         </w:rPr>
-        <w:lastRenderedPageBreak/>
         <w:t>3.13.3 Cloud Infrastructure</w:t>
       </w:r>
       <w:bookmarkEnd w:id="31"/>
@@ -9484,6 +9292,7 @@
         <w:rPr>
           <w:rFonts w:ascii="Aptos Display" w:hAnsi="Aptos Display"/>
         </w:rPr>
+        <w:lastRenderedPageBreak/>
         <w:t>Cloud Run allows the detection system to scale automatically based on request volume while maintaining isolation between scans. Environment variables were used to manage configuration values securely, ensuring that sensitive information such as API keys was not hardcoded into the application.</w:t>
       </w:r>
     </w:p>
@@ -9568,18 +9377,8 @@
           <w:b/>
           <w:bCs/>
         </w:rPr>
-        <w:t xml:space="preserve">Cloud </w:t>
-      </w:r>
-      <w:proofErr w:type="spellStart"/>
-      <w:r>
-        <w:rPr>
-          <w:rFonts w:ascii="Aptos Display" w:hAnsi="Aptos Display"/>
-          <w:b/>
-          <w:bCs/>
-        </w:rPr>
-        <w:t>Firestore</w:t>
-      </w:r>
-      <w:proofErr w:type="spellEnd"/>
+        <w:t>Cloud Firestore</w:t>
+      </w:r>
       <w:r>
         <w:rPr>
           <w:rFonts w:ascii="Aptos Display" w:hAnsi="Aptos Display"/>
@@ -9632,18 +9431,8 @@
           <w:b/>
           <w:bCs/>
         </w:rPr>
-        <w:t xml:space="preserve">Cloud </w:t>
-      </w:r>
-      <w:proofErr w:type="spellStart"/>
-      <w:r>
-        <w:rPr>
-          <w:rFonts w:ascii="Aptos Display" w:hAnsi="Aptos Display"/>
-          <w:b/>
-          <w:bCs/>
-        </w:rPr>
-        <w:t>Firestore</w:t>
-      </w:r>
-      <w:proofErr w:type="spellEnd"/>
+        <w:t>Cloud Firestore</w:t>
+      </w:r>
       <w:r>
         <w:rPr>
           <w:rFonts w:ascii="Aptos Display" w:hAnsi="Aptos Display"/>
@@ -9734,35 +9523,7 @@
         <w:rPr>
           <w:rFonts w:ascii="Aptos Display" w:hAnsi="Aptos Display"/>
         </w:rPr>
-        <w:t xml:space="preserve">Original and </w:t>
-      </w:r>
-      <w:proofErr w:type="spellStart"/>
-      <w:r>
-        <w:rPr>
-          <w:rFonts w:ascii="Aptos Display" w:hAnsi="Aptos Display"/>
-        </w:rPr>
-        <w:t>stego</w:t>
-      </w:r>
-      <w:proofErr w:type="spellEnd"/>
-      <w:r>
-        <w:rPr>
-          <w:rFonts w:ascii="Aptos Display" w:hAnsi="Aptos Display"/>
-        </w:rPr>
-        <w:t xml:space="preserve"> images are explicitly linked through metadata stored in </w:t>
-      </w:r>
-      <w:proofErr w:type="spellStart"/>
-      <w:r>
-        <w:rPr>
-          <w:rFonts w:ascii="Aptos Display" w:hAnsi="Aptos Display"/>
-        </w:rPr>
-        <w:t>Firestore</w:t>
-      </w:r>
-      <w:proofErr w:type="spellEnd"/>
-      <w:r>
-        <w:rPr>
-          <w:rFonts w:ascii="Aptos Display" w:hAnsi="Aptos Display"/>
-        </w:rPr>
-        <w:t>.</w:t>
+        <w:t>Original and stego images are explicitly linked through metadata stored in Firestore.</w:t>
       </w:r>
     </w:p>
     <w:p>
@@ -9800,7 +9561,6 @@
         <w:rPr>
           <w:rFonts w:ascii="Aptos Display" w:hAnsi="Aptos Display"/>
         </w:rPr>
-        <w:lastRenderedPageBreak/>
         <w:t>Feature extraction and anomaly detection operate deterministically given the same inputs.</w:t>
       </w:r>
     </w:p>
@@ -9847,7 +9607,14 @@
         <w:rPr>
           <w:rFonts w:ascii="Aptos Display" w:hAnsi="Aptos Display"/>
         </w:rPr>
-        <w:t>The tools, technologies, and environment used in this study were carefully selected to support the design, implementation, and evaluation of a hybrid steganographic malware detection system. By leveraging Python-based analysis, YARA signature scanning, machine learning</w:t>
+        <w:t xml:space="preserve">The tools, technologies, and environment used in this study were carefully selected to </w:t>
+      </w:r>
+      <w:r>
+        <w:rPr>
+          <w:rFonts w:ascii="Aptos Display" w:hAnsi="Aptos Display"/>
+        </w:rPr>
+        <w:lastRenderedPageBreak/>
+        <w:t>support the design, implementation, and evaluation of a hybrid steganographic malware detection system. By leveraging Python-based analysis, YARA signature scanning, machine learning</w:t>
       </w:r>
       <w:r>
         <w:rPr>
@@ -9922,7 +9689,25 @@
         <w:rPr>
           <w:rFonts w:ascii="Aptos Display" w:hAnsi="Aptos Display"/>
         </w:rPr>
-        <w:t>Despite these limitations, the results are generalisable within the defined scope of static detection of image-based steganographic malware. The methodology and hybrid detection framework provide a reproducible and extensible foundation that can be adapted in future work to include additional embedding techniques, datasets, and detection strategies.</w:t>
+        <w:t xml:space="preserve">Despite these limitations, the results </w:t>
+      </w:r>
+      <w:r>
+        <w:rPr>
+          <w:rFonts w:ascii="Aptos Display" w:hAnsi="Aptos Display"/>
+        </w:rPr>
+        <w:t>denote</w:t>
+      </w:r>
+      <w:r>
+        <w:rPr>
+          <w:rFonts w:ascii="Aptos Display" w:hAnsi="Aptos Display"/>
+        </w:rPr>
+        <w:t xml:space="preserve"> the defined experimental scope</w:t>
+      </w:r>
+      <w:r>
+        <w:rPr>
+          <w:rFonts w:ascii="Aptos Display" w:hAnsi="Aptos Display"/>
+        </w:rPr>
+        <w:t xml:space="preserve"> of static detection of image-based steganographic malware. The methodology and hybrid detection framework provide a reproducible and extensible foundation that can be adapted in future work to include additional embedding techniques, datasets, and detection strategies.</w:t>
       </w:r>
     </w:p>
     <w:p>
@@ -9958,16 +9743,7 @@
           <w:sz w:val="24"/>
           <w:szCs w:val="24"/>
         </w:rPr>
-        <w:t xml:space="preserve">This study involves the analysis of steganographic techniques and malware detection mechanisms, which raises important ethical and safety considerations. To ensure that the research does not introduce security risks, violate ethical standards, or cause unintended </w:t>
-      </w:r>
-      <w:r>
-        <w:rPr>
-          <w:rFonts w:ascii="Aptos Display" w:hAnsi="Aptos Display"/>
-          <w:sz w:val="24"/>
-          <w:szCs w:val="24"/>
-        </w:rPr>
-        <w:lastRenderedPageBreak/>
-        <w:t>harm, a number of precautionary measures were adopted throughout the design, implementation, and evaluation phases of the study.</w:t>
+        <w:t>This study involves the analysis of steganographic techniques and malware detection mechanisms, which raises important ethical and safety considerations. To ensure that the research does not introduce security risks, violate ethical standards, or cause unintended harm, a number of precautionary measures were adopted throughout the design, implementation, and evaluation phases of the study.</w:t>
       </w:r>
     </w:p>
     <w:p>
@@ -10005,8 +9781,6 @@
       <w:r>
         <w:rPr>
           <w:rFonts w:ascii="Aptos Display" w:hAnsi="Aptos Display"/>
-          <w:b/>
-          <w:bCs/>
         </w:rPr>
         <w:t>no real-world malicious binaries were used</w:t>
       </w:r>
@@ -10020,37 +9794,38 @@
         <w:rPr>
           <w:rFonts w:ascii="Aptos Display" w:hAnsi="Aptos Display"/>
         </w:rPr>
-        <w:t xml:space="preserve">AI-generated non-dangerous malwares and </w:t>
-      </w:r>
-      <w:r>
-        <w:rPr>
-          <w:rFonts w:ascii="Aptos Display" w:hAnsi="Aptos Display"/>
-          <w:b/>
-          <w:bCs/>
-        </w:rPr>
-        <w:t>test string</w:t>
-      </w:r>
-      <w:r>
-        <w:rPr>
-          <w:rFonts w:ascii="Aptos Display" w:hAnsi="Aptos Display"/>
-          <w:b/>
-          <w:bCs/>
-        </w:rPr>
-        <w:t xml:space="preserve">s such as </w:t>
-      </w:r>
-      <w:r>
-        <w:rPr>
-          <w:rFonts w:ascii="Aptos Display" w:hAnsi="Aptos Display"/>
-          <w:b/>
-          <w:bCs/>
-        </w:rPr>
-        <w:t>EICAR</w:t>
-      </w:r>
-      <w:r>
-        <w:rPr>
-          <w:rFonts w:ascii="Aptos Display" w:hAnsi="Aptos Display"/>
-        </w:rPr>
-        <w:t xml:space="preserve"> as a safe and widely accepted malware simulation standard.</w:t>
+        <w:t xml:space="preserve">AI-generated non-executable </w:t>
+      </w:r>
+      <w:r>
+        <w:rPr>
+          <w:rFonts w:ascii="Aptos Display" w:hAnsi="Aptos Display"/>
+        </w:rPr>
+        <w:t xml:space="preserve">synthetic </w:t>
+      </w:r>
+      <w:r>
+        <w:rPr>
+          <w:rFonts w:ascii="Aptos Display" w:hAnsi="Aptos Display"/>
+        </w:rPr>
+        <w:lastRenderedPageBreak/>
+        <w:t xml:space="preserve">payload strings, </w:t>
+      </w:r>
+      <w:r>
+        <w:rPr>
+          <w:rFonts w:ascii="Aptos Display" w:hAnsi="Aptos Display"/>
+        </w:rPr>
+        <w:t xml:space="preserve">including </w:t>
+      </w:r>
+      <w:r>
+        <w:rPr>
+          <w:rFonts w:ascii="Aptos Display" w:hAnsi="Aptos Display"/>
+        </w:rPr>
+        <w:t>AI-generated synthetic test strings, as well as the EICAR antivirus test string, which is widely used as a safe malware simulation standard</w:t>
+      </w:r>
+      <w:r>
+        <w:rPr>
+          <w:rFonts w:ascii="Aptos Display" w:hAnsi="Aptos Display"/>
+        </w:rPr>
+        <w:t>.</w:t>
       </w:r>
     </w:p>
     <w:p>
@@ -10071,7 +9846,19 @@
         <w:rPr>
           <w:rFonts w:ascii="Aptos Display" w:hAnsi="Aptos Display"/>
         </w:rPr>
-        <w:t xml:space="preserve">Ai-generated </w:t>
+        <w:t>A</w:t>
+      </w:r>
+      <w:r>
+        <w:rPr>
+          <w:rFonts w:ascii="Aptos Display" w:hAnsi="Aptos Display"/>
+        </w:rPr>
+        <w:t>I</w:t>
+      </w:r>
+      <w:r>
+        <w:rPr>
+          <w:rFonts w:ascii="Aptos Display" w:hAnsi="Aptos Display"/>
+        </w:rPr>
+        <w:t xml:space="preserve">-generated </w:t>
       </w:r>
       <w:r>
         <w:rPr>
@@ -10097,8 +9884,6 @@
       <w:r>
         <w:rPr>
           <w:rFonts w:ascii="Aptos Display" w:hAnsi="Aptos Display"/>
-          <w:b/>
-          <w:bCs/>
         </w:rPr>
         <w:t>non-executable string-based data</w:t>
       </w:r>
@@ -10230,14 +10015,7 @@
         <w:rPr>
           <w:rFonts w:ascii="Aptos Display" w:hAnsi="Aptos Display"/>
         </w:rPr>
-        <w:t xml:space="preserve">The datasets were used solely for academic research purposes and were not shared publicly in a form that could facilitate misuse. Access to stored images and scan results </w:t>
-      </w:r>
-      <w:r>
-        <w:rPr>
-          <w:rFonts w:ascii="Aptos Display" w:hAnsi="Aptos Display"/>
-        </w:rPr>
-        <w:lastRenderedPageBreak/>
-        <w:t>was restricted to the research environment, and experimental runs were isolated to prevent cross-contamination between datasets.</w:t>
+        <w:t>The datasets were used solely for academic research purposes and were not shared publicly in a form that could facilitate misuse. Access to stored images and scan results was restricted to the research environment, and experimental runs were isolated to prevent cross-contamination between datasets.</w:t>
       </w:r>
     </w:p>
     <w:p>
@@ -10270,7 +10048,14 @@
         <w:rPr>
           <w:rFonts w:ascii="Aptos Display" w:hAnsi="Aptos Display"/>
         </w:rPr>
-        <w:t>The study did not involve human participants, personal data, or sensitive user information. All images used for experimentation were non-personal and did not contain identifiable information. Metadata stored in the database was limited to technical attributes required for detection and evaluation, such as file identifiers, detection results, and performance metrics.</w:t>
+        <w:t xml:space="preserve">The study did not involve human participants, personal data, or sensitive user information. All images used for experimentation were non-personal and did not contain identifiable information. Metadata stored in the database was limited to technical attributes required </w:t>
+      </w:r>
+      <w:r>
+        <w:rPr>
+          <w:rFonts w:ascii="Aptos Display" w:hAnsi="Aptos Display"/>
+        </w:rPr>
+        <w:lastRenderedPageBreak/>
+        <w:t>for detection and evaluation, such as file identifiers, detection results, and performance metrics.</w:t>
       </w:r>
     </w:p>
     <w:p>
@@ -10398,7 +10183,6 @@
           <w:rFonts w:ascii="Aptos Display" w:hAnsi="Aptos Display"/>
           <w:color w:val="auto"/>
         </w:rPr>
-        <w:lastRenderedPageBreak/>
         <w:t>References</w:t>
       </w:r>
       <w:bookmarkEnd w:id="42"/>
@@ -10408,9 +10192,6 @@
         <w:pStyle w:val="EndNoteBibliography"/>
         <w:spacing w:after="0"/>
         <w:ind w:left="720" w:hanging="720"/>
-        <w:rPr>
-          <w:rFonts w:ascii="Aptos Display" w:hAnsi="Aptos Display"/>
-        </w:rPr>
       </w:pPr>
       <w:r>
         <w:rPr>
@@ -10437,22 +10218,15 @@
         <w:fldChar w:fldCharType="separate"/>
       </w:r>
       <w:r>
-        <w:rPr>
-          <w:rFonts w:ascii="Aptos Display" w:hAnsi="Aptos Display"/>
-        </w:rPr>
         <w:t xml:space="preserve">ALABAICHI, A., AL-DABBAS, M. A. A. A. K. &amp; SALIH, A. 2020. Image steganography using least significant bit and secret map techniques. </w:t>
       </w:r>
       <w:r>
         <w:rPr>
-          <w:rFonts w:ascii="Aptos Display" w:hAnsi="Aptos Display"/>
           <w:i/>
         </w:rPr>
         <w:t>International journal of electrical &amp; computer engineering (2088-8708),</w:t>
       </w:r>
       <w:r>
-        <w:rPr>
-          <w:rFonts w:ascii="Aptos Display" w:hAnsi="Aptos Display"/>
-        </w:rPr>
         <w:t xml:space="preserve"> 10.</w:t>
       </w:r>
     </w:p>
@@ -10461,27 +10235,17 @@
         <w:pStyle w:val="EndNoteBibliography"/>
         <w:spacing w:after="0"/>
         <w:ind w:left="720" w:hanging="720"/>
-        <w:rPr>
-          <w:rFonts w:ascii="Aptos Display" w:hAnsi="Aptos Display"/>
-        </w:rPr>
-      </w:pPr>
-      <w:r>
-        <w:rPr>
-          <w:rFonts w:ascii="Aptos Display" w:hAnsi="Aptos Display"/>
-        </w:rPr>
+      </w:pPr>
+      <w:r>
         <w:t xml:space="preserve">ALAZAB, M. &amp; PHAM, T. 2023. Stegomalware: A systematic survey of malware hiding and detection in images, machine learning models and research challenges. </w:t>
       </w:r>
       <w:r>
         <w:rPr>
-          <w:rFonts w:ascii="Aptos Display" w:hAnsi="Aptos Display"/>
           <w:i/>
         </w:rPr>
         <w:t>Authorea Preprints</w:t>
       </w:r>
       <w:r>
-        <w:rPr>
-          <w:rFonts w:ascii="Aptos Display" w:hAnsi="Aptos Display"/>
-        </w:rPr>
         <w:t>.</w:t>
       </w:r>
     </w:p>
@@ -10490,27 +10254,18 @@
         <w:pStyle w:val="EndNoteBibliography"/>
         <w:spacing w:after="0"/>
         <w:ind w:left="720" w:hanging="720"/>
-        <w:rPr>
-          <w:rFonts w:ascii="Aptos Display" w:hAnsi="Aptos Display"/>
-        </w:rPr>
-      </w:pPr>
-      <w:r>
-        <w:rPr>
-          <w:rFonts w:ascii="Aptos Display" w:hAnsi="Aptos Display"/>
-        </w:rPr>
+      </w:pPr>
+      <w:r>
+        <w:lastRenderedPageBreak/>
         <w:t xml:space="preserve">ALMOMANI, I., ALKHAYER, A. &amp; EL-SHAFAI, W. 2022. Novel Ransomware Hiding Model Using HEVC Steganography Approach. </w:t>
       </w:r>
       <w:r>
         <w:rPr>
-          <w:rFonts w:ascii="Aptos Display" w:hAnsi="Aptos Display"/>
           <w:i/>
         </w:rPr>
         <w:t>Computers, Materials &amp; Continua,</w:t>
       </w:r>
       <w:r>
-        <w:rPr>
-          <w:rFonts w:ascii="Aptos Display" w:hAnsi="Aptos Display"/>
-        </w:rPr>
         <w:t xml:space="preserve"> 70.</w:t>
       </w:r>
     </w:p>
@@ -10519,15 +10274,18 @@
         <w:pStyle w:val="EndNoteBibliography"/>
         <w:spacing w:after="0"/>
         <w:ind w:left="720" w:hanging="720"/>
-        <w:rPr>
-          <w:rFonts w:ascii="Aptos Display" w:hAnsi="Aptos Display"/>
-        </w:rPr>
-      </w:pPr>
-      <w:r>
-        <w:rPr>
-          <w:rFonts w:ascii="Aptos Display" w:hAnsi="Aptos Display"/>
-        </w:rPr>
-        <w:t>AMALAN, A. Malware Evolution.</w:t>
+      </w:pPr>
+      <w:r>
+        <w:t xml:space="preserve">BRYMAN, A. 2016. </w:t>
+      </w:r>
+      <w:r>
+        <w:rPr>
+          <w:i/>
+        </w:rPr>
+        <w:t>Social research methods</w:t>
+      </w:r>
+      <w:r>
+        <w:t>, Oxford university press.</w:t>
       </w:r>
     </w:p>
     <w:p>
@@ -10535,28 +10293,18 @@
         <w:pStyle w:val="EndNoteBibliography"/>
         <w:spacing w:after="0"/>
         <w:ind w:left="720" w:hanging="720"/>
-        <w:rPr>
-          <w:rFonts w:ascii="Aptos Display" w:hAnsi="Aptos Display"/>
-        </w:rPr>
-      </w:pPr>
-      <w:r>
-        <w:rPr>
-          <w:rFonts w:ascii="Aptos Display" w:hAnsi="Aptos Display"/>
-        </w:rPr>
-        <w:t xml:space="preserve">BRYMAN, A. 2016. </w:t>
-      </w:r>
-      <w:r>
-        <w:rPr>
-          <w:rFonts w:ascii="Aptos Display" w:hAnsi="Aptos Display"/>
+      </w:pPr>
+      <w:r>
+        <w:t xml:space="preserve">CRESWELL, J. W. &amp; CRESWELL, J. D. 2017. </w:t>
+      </w:r>
+      <w:r>
+        <w:rPr>
           <w:i/>
         </w:rPr>
-        <w:t>Social research methods</w:t>
-      </w:r>
-      <w:r>
-        <w:rPr>
-          <w:rFonts w:ascii="Aptos Display" w:hAnsi="Aptos Display"/>
-        </w:rPr>
-        <w:t>, Oxford university press.</w:t>
+        <w:t>Research design: Qualitative, quantitative, and mixed methods approaches</w:t>
+      </w:r>
+      <w:r>
+        <w:t>, Sage publications.</w:t>
       </w:r>
     </w:p>
     <w:p>
@@ -10564,28 +10312,27 @@
         <w:pStyle w:val="EndNoteBibliography"/>
         <w:spacing w:after="0"/>
         <w:ind w:left="720" w:hanging="720"/>
-        <w:rPr>
-          <w:rFonts w:ascii="Aptos Display" w:hAnsi="Aptos Display"/>
-        </w:rPr>
-      </w:pPr>
-      <w:r>
-        <w:rPr>
-          <w:rFonts w:ascii="Aptos Display" w:hAnsi="Aptos Display"/>
-        </w:rPr>
-        <w:t xml:space="preserve">CRESWELL, J. W. &amp; CRESWELL, J. D. 2017. </w:t>
-      </w:r>
-      <w:r>
-        <w:rPr>
-          <w:rFonts w:ascii="Aptos Display" w:hAnsi="Aptos Display"/>
+      </w:pPr>
+      <w:r>
+        <w:t xml:space="preserve">GRECO, C. &amp; IANNI, M. 2025. A cross-architecture malware detection approach based on intermediate representation. </w:t>
+      </w:r>
+      <w:r>
+        <w:rPr>
           <w:i/>
         </w:rPr>
-        <w:t>Research design: Qualitative, quantitative, and mixed methods approaches</w:t>
-      </w:r>
-      <w:r>
-        <w:rPr>
-          <w:rFonts w:ascii="Aptos Display" w:hAnsi="Aptos Display"/>
-        </w:rPr>
-        <w:t>, Sage publications.</w:t>
+        <w:t>Journal of Information Security and Applications,</w:t>
+      </w:r>
+      <w:r>
+        <w:t xml:space="preserve"> 93</w:t>
+      </w:r>
+      <w:r>
+        <w:rPr>
+          <w:b/>
+        </w:rPr>
+        <w:t>,</w:t>
+      </w:r>
+      <w:r>
+        <w:t xml:space="preserve"> 104117.</w:t>
       </w:r>
     </w:p>
     <w:p>
@@ -10593,27 +10340,17 @@
         <w:pStyle w:val="EndNoteBibliography"/>
         <w:spacing w:after="0"/>
         <w:ind w:left="720" w:hanging="720"/>
-        <w:rPr>
-          <w:rFonts w:ascii="Aptos Display" w:hAnsi="Aptos Display"/>
-        </w:rPr>
-      </w:pPr>
-      <w:r>
-        <w:rPr>
-          <w:rFonts w:ascii="Aptos Display" w:hAnsi="Aptos Display"/>
-        </w:rPr>
+      </w:pPr>
+      <w:r>
         <w:t xml:space="preserve">HAMMADEH, K. &amp; KAVITHA, M. 2023. Unraveling ransomware: Detecting threats with advanced machine learning algorithms. </w:t>
       </w:r>
       <w:r>
         <w:rPr>
-          <w:rFonts w:ascii="Aptos Display" w:hAnsi="Aptos Display"/>
           <w:i/>
         </w:rPr>
         <w:t>International Journal of Advanced Computer Science and Applications,</w:t>
       </w:r>
       <w:r>
-        <w:rPr>
-          <w:rFonts w:ascii="Aptos Display" w:hAnsi="Aptos Display"/>
-        </w:rPr>
         <w:t xml:space="preserve"> 14.</w:t>
       </w:r>
     </w:p>
@@ -10622,40 +10359,26 @@
         <w:pStyle w:val="EndNoteBibliography"/>
         <w:spacing w:after="0"/>
         <w:ind w:left="720" w:hanging="720"/>
-        <w:rPr>
-          <w:rFonts w:ascii="Aptos Display" w:hAnsi="Aptos Display"/>
-        </w:rPr>
-      </w:pPr>
-      <w:r>
-        <w:rPr>
-          <w:rFonts w:ascii="Aptos Display" w:hAnsi="Aptos Display"/>
-        </w:rPr>
+      </w:pPr>
+      <w:r>
         <w:t xml:space="preserve">HEVNER, A., R, A., MARCH, S., T, S., PARK, PARK, J., RAM &amp; SUDHA 2004. Design Science in Information Systems Research. </w:t>
       </w:r>
       <w:r>
         <w:rPr>
-          <w:rFonts w:ascii="Aptos Display" w:hAnsi="Aptos Display"/>
           <w:i/>
         </w:rPr>
         <w:t>Management Information Systems Quarterly,</w:t>
       </w:r>
       <w:r>
-        <w:rPr>
-          <w:rFonts w:ascii="Aptos Display" w:hAnsi="Aptos Display"/>
-        </w:rPr>
         <w:t xml:space="preserve"> 28</w:t>
       </w:r>
       <w:r>
         <w:rPr>
-          <w:rFonts w:ascii="Aptos Display" w:hAnsi="Aptos Display"/>
           <w:b/>
         </w:rPr>
         <w:t>,</w:t>
       </w:r>
       <w:r>
-        <w:rPr>
-          <w:rFonts w:ascii="Aptos Display" w:hAnsi="Aptos Display"/>
-        </w:rPr>
         <w:t xml:space="preserve"> 75.</w:t>
       </w:r>
     </w:p>
@@ -10664,14 +10387,8 @@
         <w:pStyle w:val="EndNoteBibliography"/>
         <w:spacing w:after="0"/>
         <w:ind w:left="720" w:hanging="720"/>
-        <w:rPr>
-          <w:rFonts w:ascii="Aptos Display" w:hAnsi="Aptos Display"/>
-        </w:rPr>
-      </w:pPr>
-      <w:r>
-        <w:rPr>
-          <w:rFonts w:ascii="Aptos Display" w:hAnsi="Aptos Display"/>
-        </w:rPr>
+      </w:pPr>
+      <w:r>
         <w:t>HUSSAIN HUSSAIN, R. A. 2025. Evaluating antivirus software: a comparative analysis of detection methodologies and performance metrics in modern antivirus solutions.</w:t>
       </w:r>
     </w:p>
@@ -10680,40 +10397,26 @@
         <w:pStyle w:val="EndNoteBibliography"/>
         <w:spacing w:after="0"/>
         <w:ind w:left="720" w:hanging="720"/>
-        <w:rPr>
-          <w:rFonts w:ascii="Aptos Display" w:hAnsi="Aptos Display"/>
-        </w:rPr>
-      </w:pPr>
-      <w:r>
-        <w:rPr>
-          <w:rFonts w:ascii="Aptos Display" w:hAnsi="Aptos Display"/>
-        </w:rPr>
+      </w:pPr>
+      <w:r>
         <w:t xml:space="preserve">KOPTYRA, K. &amp; OGIELA, M. R. 2023. An Efficient Steganographic Protocol for WebP Files. </w:t>
       </w:r>
       <w:r>
         <w:rPr>
-          <w:rFonts w:ascii="Aptos Display" w:hAnsi="Aptos Display"/>
           <w:i/>
         </w:rPr>
         <w:t>Applied Sciences,</w:t>
       </w:r>
       <w:r>
-        <w:rPr>
-          <w:rFonts w:ascii="Aptos Display" w:hAnsi="Aptos Display"/>
-        </w:rPr>
         <w:t xml:space="preserve"> 13</w:t>
       </w:r>
       <w:r>
         <w:rPr>
-          <w:rFonts w:ascii="Aptos Display" w:hAnsi="Aptos Display"/>
           <w:b/>
         </w:rPr>
         <w:t>,</w:t>
       </w:r>
       <w:r>
-        <w:rPr>
-          <w:rFonts w:ascii="Aptos Display" w:hAnsi="Aptos Display"/>
-        </w:rPr>
         <w:t xml:space="preserve"> 12404.</w:t>
       </w:r>
     </w:p>
@@ -10722,14 +10425,8 @@
         <w:pStyle w:val="EndNoteBibliography"/>
         <w:spacing w:after="0"/>
         <w:ind w:left="720" w:hanging="720"/>
-        <w:rPr>
-          <w:rFonts w:ascii="Aptos Display" w:hAnsi="Aptos Display"/>
-        </w:rPr>
-      </w:pPr>
-      <w:r>
-        <w:rPr>
-          <w:rFonts w:ascii="Aptos Display" w:hAnsi="Aptos Display"/>
-        </w:rPr>
+      </w:pPr>
+      <w:r>
         <w:t>KOTRONOULAS, G. &amp; PAPADOPOULOU, C. A primer to experimental and nonexperimental quantitative research: the example case of tobacco-related mouth cancer.  Seminars in Oncology Nursing, 2023. Elsevier, 151396.</w:t>
       </w:r>
     </w:p>
@@ -10738,40 +10435,26 @@
         <w:pStyle w:val="EndNoteBibliography"/>
         <w:spacing w:after="0"/>
         <w:ind w:left="720" w:hanging="720"/>
-        <w:rPr>
-          <w:rFonts w:ascii="Aptos Display" w:hAnsi="Aptos Display"/>
-        </w:rPr>
-      </w:pPr>
-      <w:r>
-        <w:rPr>
-          <w:rFonts w:ascii="Aptos Display" w:hAnsi="Aptos Display"/>
-        </w:rPr>
+      </w:pPr>
+      <w:r>
         <w:t xml:space="preserve">KUMAR, J., RAJENDRAN, B. &amp; SUDARSAN, S. D. 2023. Zero-day malware classification and detection using machine learning. </w:t>
       </w:r>
       <w:r>
         <w:rPr>
-          <w:rFonts w:ascii="Aptos Display" w:hAnsi="Aptos Display"/>
           <w:i/>
         </w:rPr>
         <w:t>SN Computer Science,</w:t>
       </w:r>
       <w:r>
-        <w:rPr>
-          <w:rFonts w:ascii="Aptos Display" w:hAnsi="Aptos Display"/>
-        </w:rPr>
         <w:t xml:space="preserve"> 5</w:t>
       </w:r>
       <w:r>
         <w:rPr>
-          <w:rFonts w:ascii="Aptos Display" w:hAnsi="Aptos Display"/>
           <w:b/>
         </w:rPr>
         <w:t>,</w:t>
       </w:r>
       <w:r>
-        <w:rPr>
-          <w:rFonts w:ascii="Aptos Display" w:hAnsi="Aptos Display"/>
-        </w:rPr>
         <w:t xml:space="preserve"> 93.</w:t>
       </w:r>
     </w:p>
@@ -10780,41 +10463,27 @@
         <w:pStyle w:val="EndNoteBibliography"/>
         <w:spacing w:after="0"/>
         <w:ind w:left="720" w:hanging="720"/>
-        <w:rPr>
-          <w:rFonts w:ascii="Aptos Display" w:hAnsi="Aptos Display"/>
-        </w:rPr>
-      </w:pPr>
-      <w:r>
-        <w:rPr>
-          <w:rFonts w:ascii="Aptos Display" w:hAnsi="Aptos Display"/>
-        </w:rPr>
-        <w:t xml:space="preserve">LIU, J., WANG, Y., HAN, Q. &amp; GAO, J. 2022. A sensitive image encryption algorithm based on a higher-dimensional chaotic map and steganography. </w:t>
-      </w:r>
-      <w:r>
-        <w:rPr>
-          <w:rFonts w:ascii="Aptos Display" w:hAnsi="Aptos Display"/>
+      </w:pPr>
+      <w:r>
+        <w:t xml:space="preserve">MANDAL, P. C., MUKHERJEE, I., PAUL, G. &amp; CHATTERJI, B. 2022. Digital image steganography: A literature survey. </w:t>
+      </w:r>
+      <w:r>
+        <w:rPr>
           <w:i/>
         </w:rPr>
-        <w:t>International Journal of Bifurcation and Chaos,</w:t>
-      </w:r>
-      <w:r>
-        <w:rPr>
-          <w:rFonts w:ascii="Aptos Display" w:hAnsi="Aptos Display"/>
-        </w:rPr>
-        <w:t xml:space="preserve"> 32</w:t>
-      </w:r>
-      <w:r>
-        <w:rPr>
-          <w:rFonts w:ascii="Aptos Display" w:hAnsi="Aptos Display"/>
+        <w:t>Information sciences,</w:t>
+      </w:r>
+      <w:r>
+        <w:t xml:space="preserve"> 609</w:t>
+      </w:r>
+      <w:r>
+        <w:rPr>
           <w:b/>
         </w:rPr>
         <w:t>,</w:t>
       </w:r>
       <w:r>
-        <w:rPr>
-          <w:rFonts w:ascii="Aptos Display" w:hAnsi="Aptos Display"/>
-        </w:rPr>
-        <w:t xml:space="preserve"> 2250004.</w:t>
+        <w:t xml:space="preserve"> 1451–1488.</w:t>
       </w:r>
     </w:p>
     <w:p>
@@ -10822,41 +10491,24 @@
         <w:pStyle w:val="EndNoteBibliography"/>
         <w:spacing w:after="0"/>
         <w:ind w:left="720" w:hanging="720"/>
-        <w:rPr>
-          <w:rFonts w:ascii="Aptos Display" w:hAnsi="Aptos Display"/>
-        </w:rPr>
-      </w:pPr>
-      <w:r>
-        <w:rPr>
-          <w:rFonts w:ascii="Aptos Display" w:hAnsi="Aptos Display"/>
-        </w:rPr>
-        <w:t xml:space="preserve">MANDAL, P. C., MUKHERJEE, I., PAUL, G. &amp; CHATTERJI, B. 2022. Digital image steganography: A literature survey. </w:t>
-      </w:r>
-      <w:r>
-        <w:rPr>
-          <w:rFonts w:ascii="Aptos Display" w:hAnsi="Aptos Display"/>
+      </w:pPr>
+      <w:r>
+        <w:t xml:space="preserve">MARUASHVILI, E. 2024. The Most Common Research Paradigms. </w:t>
+      </w:r>
+      <w:r>
+        <w:rPr>
           <w:i/>
         </w:rPr>
-        <w:t>Information sciences,</w:t>
-      </w:r>
-      <w:r>
-        <w:rPr>
-          <w:rFonts w:ascii="Aptos Display" w:hAnsi="Aptos Display"/>
-        </w:rPr>
-        <w:t xml:space="preserve"> 609</w:t>
-      </w:r>
-      <w:r>
-        <w:rPr>
-          <w:rFonts w:ascii="Aptos Display" w:hAnsi="Aptos Display"/>
+        <w:t>Georgian Academy of Business Sciences" Moambe"</w:t>
+      </w:r>
+      <w:r>
+        <w:rPr>
           <w:b/>
         </w:rPr>
         <w:t>,</w:t>
       </w:r>
       <w:r>
-        <w:rPr>
-          <w:rFonts w:ascii="Aptos Display" w:hAnsi="Aptos Display"/>
-        </w:rPr>
-        <w:t xml:space="preserve"> 1451–1488.</w:t>
+        <w:t xml:space="preserve"> 14–17.</w:t>
       </w:r>
     </w:p>
     <w:p>
@@ -10864,35 +10516,9 @@
         <w:pStyle w:val="EndNoteBibliography"/>
         <w:spacing w:after="0"/>
         <w:ind w:left="720" w:hanging="720"/>
-        <w:rPr>
-          <w:rFonts w:ascii="Aptos Display" w:hAnsi="Aptos Display"/>
-        </w:rPr>
-      </w:pPr>
-      <w:r>
-        <w:rPr>
-          <w:rFonts w:ascii="Aptos Display" w:hAnsi="Aptos Display"/>
-        </w:rPr>
-        <w:t xml:space="preserve">MARUASHVILI, E. 2024. The Most Common Research Paradigms. </w:t>
-      </w:r>
-      <w:r>
-        <w:rPr>
-          <w:rFonts w:ascii="Aptos Display" w:hAnsi="Aptos Display"/>
-          <w:i/>
-        </w:rPr>
-        <w:t>Georgian Academy of Business Sciences" Moambe"</w:t>
-      </w:r>
-      <w:r>
-        <w:rPr>
-          <w:rFonts w:ascii="Aptos Display" w:hAnsi="Aptos Display"/>
-          <w:b/>
-        </w:rPr>
-        <w:t>,</w:t>
-      </w:r>
-      <w:r>
-        <w:rPr>
-          <w:rFonts w:ascii="Aptos Display" w:hAnsi="Aptos Display"/>
-        </w:rPr>
-        <w:t xml:space="preserve"> 14–17.</w:t>
+      </w:pPr>
+      <w:r>
+        <w:t>MIRZA, S., ABBAS, H., SHAHID, W. B., SHAFQAT, N., FUGINI, M., IQBAL, Z. &amp; MUHAMMAD, Z. A malware evasion technique for auditing android anti-malware solutions.  2021 IEEE 30th International Conference on Enabling Technologies: Infrastructure for Collaborative Enterprises (WETICE), 2021. IEEE, 125–130.</w:t>
       </w:r>
     </w:p>
     <w:p>
@@ -10900,15 +10526,9 @@
         <w:pStyle w:val="EndNoteBibliography"/>
         <w:spacing w:after="0"/>
         <w:ind w:left="720" w:hanging="720"/>
-        <w:rPr>
-          <w:rFonts w:ascii="Aptos Display" w:hAnsi="Aptos Display"/>
-        </w:rPr>
-      </w:pPr>
-      <w:r>
-        <w:rPr>
-          <w:rFonts w:ascii="Aptos Display" w:hAnsi="Aptos Display"/>
-        </w:rPr>
-        <w:t>MIRZA, S., ABBAS, H., SHAHID, W. B., SHAFQAT, N., FUGINI, M., IQBAL, Z. &amp; MUHAMMAD, Z. A malware evasion technique for auditing android anti-malware solutions.  2021 IEEE 30th International Conference on Enabling Technologies: Infrastructure for Collaborative Enterprises (WETICE), 2021. IEEE, 125–130.</w:t>
+      </w:pPr>
+      <w:r>
+        <w:t>MORKEL, T., ELOFF, J. H. &amp; OLIVIER, M. S. An overview of image steganography.  Issa, 2005. 1–11.</w:t>
       </w:r>
     </w:p>
     <w:p>
@@ -10916,15 +10536,27 @@
         <w:pStyle w:val="EndNoteBibliography"/>
         <w:spacing w:after="0"/>
         <w:ind w:left="720" w:hanging="720"/>
-        <w:rPr>
-          <w:rFonts w:ascii="Aptos Display" w:hAnsi="Aptos Display"/>
-        </w:rPr>
-      </w:pPr>
-      <w:r>
-        <w:rPr>
-          <w:rFonts w:ascii="Aptos Display" w:hAnsi="Aptos Display"/>
-        </w:rPr>
-        <w:t>MORKEL, T., ELOFF, J. H. &amp; OLIVIER, M. S. An overview of image steganography.  Issa, 2005. 1–11.</w:t>
+      </w:pPr>
+      <w:r>
+        <w:t xml:space="preserve">PARK, Y. S., KONGE, L. &amp; ARTINO JR, A. R. 2020. The positivism paradigm of research. </w:t>
+      </w:r>
+      <w:r>
+        <w:rPr>
+          <w:i/>
+        </w:rPr>
+        <w:t>Academic medicine,</w:t>
+      </w:r>
+      <w:r>
+        <w:t xml:space="preserve"> 95</w:t>
+      </w:r>
+      <w:r>
+        <w:rPr>
+          <w:b/>
+        </w:rPr>
+        <w:t>,</w:t>
+      </w:r>
+      <w:r>
+        <w:t xml:space="preserve"> 690–694.</w:t>
       </w:r>
     </w:p>
     <w:p>
@@ -10932,41 +10564,27 @@
         <w:pStyle w:val="EndNoteBibliography"/>
         <w:spacing w:after="0"/>
         <w:ind w:left="720" w:hanging="720"/>
-        <w:rPr>
-          <w:rFonts w:ascii="Aptos Display" w:hAnsi="Aptos Display"/>
-        </w:rPr>
-      </w:pPr>
-      <w:r>
-        <w:rPr>
-          <w:rFonts w:ascii="Aptos Display" w:hAnsi="Aptos Display"/>
-        </w:rPr>
-        <w:t xml:space="preserve">PARK, Y. S., KONGE, L. &amp; ARTINO JR, A. R. 2020. The positivism paradigm of research. </w:t>
-      </w:r>
-      <w:r>
-        <w:rPr>
-          <w:rFonts w:ascii="Aptos Display" w:hAnsi="Aptos Display"/>
+      </w:pPr>
+      <w:r>
+        <w:t xml:space="preserve">REHMAN, A. A. &amp; ALHARTHI, K. 2016. An introduction to research paradigms. </w:t>
+      </w:r>
+      <w:r>
+        <w:rPr>
           <w:i/>
         </w:rPr>
-        <w:t>Academic medicine,</w:t>
-      </w:r>
-      <w:r>
-        <w:rPr>
-          <w:rFonts w:ascii="Aptos Display" w:hAnsi="Aptos Display"/>
-        </w:rPr>
-        <w:t xml:space="preserve"> 95</w:t>
-      </w:r>
-      <w:r>
-        <w:rPr>
-          <w:rFonts w:ascii="Aptos Display" w:hAnsi="Aptos Display"/>
+        <w:t>International journal of educational investigations,</w:t>
+      </w:r>
+      <w:r>
+        <w:t xml:space="preserve"> 3</w:t>
+      </w:r>
+      <w:r>
+        <w:rPr>
           <w:b/>
         </w:rPr>
         <w:t>,</w:t>
       </w:r>
       <w:r>
-        <w:rPr>
-          <w:rFonts w:ascii="Aptos Display" w:hAnsi="Aptos Display"/>
-        </w:rPr>
-        <w:t xml:space="preserve"> 690–694.</w:t>
+        <w:t xml:space="preserve"> 51–59.</w:t>
       </w:r>
     </w:p>
     <w:p>
@@ -10974,41 +10592,24 @@
         <w:pStyle w:val="EndNoteBibliography"/>
         <w:spacing w:after="0"/>
         <w:ind w:left="720" w:hanging="720"/>
-        <w:rPr>
-          <w:rFonts w:ascii="Aptos Display" w:hAnsi="Aptos Display"/>
-        </w:rPr>
-      </w:pPr>
-      <w:r>
-        <w:rPr>
-          <w:rFonts w:ascii="Aptos Display" w:hAnsi="Aptos Display"/>
-        </w:rPr>
-        <w:t xml:space="preserve">REHMAN, A. A. &amp; ALHARTHI, K. 2016. An introduction to research paradigms. </w:t>
-      </w:r>
-      <w:r>
-        <w:rPr>
-          <w:rFonts w:ascii="Aptos Display" w:hAnsi="Aptos Display"/>
+      </w:pPr>
+      <w:r>
+        <w:t xml:space="preserve">ROELOFS, G. 2003. PNG Lossless Image Compression. </w:t>
+      </w:r>
+      <w:r>
+        <w:rPr>
           <w:i/>
         </w:rPr>
-        <w:t>International journal of educational investigations,</w:t>
-      </w:r>
-      <w:r>
-        <w:rPr>
-          <w:rFonts w:ascii="Aptos Display" w:hAnsi="Aptos Display"/>
-        </w:rPr>
-        <w:t xml:space="preserve"> 3</w:t>
-      </w:r>
-      <w:r>
-        <w:rPr>
-          <w:rFonts w:ascii="Aptos Display" w:hAnsi="Aptos Display"/>
+        <w:t>Lossless Compression Handbook</w:t>
+      </w:r>
+      <w:r>
+        <w:rPr>
           <w:b/>
         </w:rPr>
         <w:t>,</w:t>
       </w:r>
       <w:r>
-        <w:rPr>
-          <w:rFonts w:ascii="Aptos Display" w:hAnsi="Aptos Display"/>
-        </w:rPr>
-        <w:t xml:space="preserve"> 51–59.</w:t>
+        <w:t xml:space="preserve"> 371–390.</w:t>
       </w:r>
     </w:p>
     <w:p>
@@ -11016,35 +10617,18 @@
         <w:pStyle w:val="EndNoteBibliography"/>
         <w:spacing w:after="0"/>
         <w:ind w:left="720" w:hanging="720"/>
-        <w:rPr>
-          <w:rFonts w:ascii="Aptos Display" w:hAnsi="Aptos Display"/>
-        </w:rPr>
-      </w:pPr>
-      <w:r>
-        <w:rPr>
-          <w:rFonts w:ascii="Aptos Display" w:hAnsi="Aptos Display"/>
-        </w:rPr>
-        <w:t xml:space="preserve">ROELOFS, G. 2003. PNG Lossless Image Compression. </w:t>
-      </w:r>
-      <w:r>
-        <w:rPr>
-          <w:rFonts w:ascii="Aptos Display" w:hAnsi="Aptos Display"/>
+      </w:pPr>
+      <w:r>
+        <w:t xml:space="preserve">SREEKUMAR, D. 2023. What is research methodology? Definition, types, and examples. </w:t>
+      </w:r>
+      <w:r>
+        <w:rPr>
           <w:i/>
         </w:rPr>
-        <w:t>Lossless Compression Handbook</w:t>
-      </w:r>
-      <w:r>
-        <w:rPr>
-          <w:rFonts w:ascii="Aptos Display" w:hAnsi="Aptos Display"/>
-          <w:b/>
-        </w:rPr>
-        <w:t>,</w:t>
-      </w:r>
-      <w:r>
-        <w:rPr>
-          <w:rFonts w:ascii="Aptos Display" w:hAnsi="Aptos Display"/>
-        </w:rPr>
-        <w:t xml:space="preserve"> 371–390.</w:t>
+        <w:t>Paperpal Blog-Academic Writing Guides</w:t>
+      </w:r>
+      <w:r>
+        <w:t>.</w:t>
       </w:r>
     </w:p>
     <w:p>
@@ -11052,28 +10636,9 @@
         <w:pStyle w:val="EndNoteBibliography"/>
         <w:spacing w:after="0"/>
         <w:ind w:left="720" w:hanging="720"/>
-        <w:rPr>
-          <w:rFonts w:ascii="Aptos Display" w:hAnsi="Aptos Display"/>
-        </w:rPr>
-      </w:pPr>
-      <w:r>
-        <w:rPr>
-          <w:rFonts w:ascii="Aptos Display" w:hAnsi="Aptos Display"/>
-        </w:rPr>
-        <w:t xml:space="preserve">SREEKUMAR, D. 2023. What is research methodology? Definition, types, and examples. </w:t>
-      </w:r>
-      <w:r>
-        <w:rPr>
-          <w:rFonts w:ascii="Aptos Display" w:hAnsi="Aptos Display"/>
-          <w:i/>
-        </w:rPr>
-        <w:t>Paperpal Blog-Academic Writing Guides</w:t>
-      </w:r>
-      <w:r>
-        <w:rPr>
-          <w:rFonts w:ascii="Aptos Display" w:hAnsi="Aptos Display"/>
-        </w:rPr>
-        <w:t>.</w:t>
+      </w:pPr>
+      <w:r>
+        <w:t>STACEY, D. Passive warden using statistical steganalysis.  Proceedings of the 3rd annual conference on Research in information technology, 2014. 27–32.</w:t>
       </w:r>
     </w:p>
     <w:p>
@@ -11081,16 +10646,9 @@
         <w:pStyle w:val="EndNoteBibliography"/>
         <w:spacing w:after="0"/>
         <w:ind w:left="720" w:hanging="720"/>
-        <w:rPr>
-          <w:rFonts w:ascii="Aptos Display" w:hAnsi="Aptos Display"/>
-        </w:rPr>
-      </w:pPr>
-      <w:r>
-        <w:rPr>
-          <w:rFonts w:ascii="Aptos Display" w:hAnsi="Aptos Display"/>
-        </w:rPr>
-        <w:lastRenderedPageBreak/>
-        <w:t>STACEY, D. Passive warden using statistical steganalysis.  Proceedings of the 3rd annual conference on Research in information technology, 2014. 27–32.</w:t>
+      </w:pPr>
+      <w:r>
+        <w:t>VAISHNAVI, V. &amp; KUECHLER, W. 2004. Design research in information systems.</w:t>
       </w:r>
     </w:p>
     <w:p>
@@ -11098,97 +10656,53 @@
         <w:pStyle w:val="EndNoteBibliography"/>
         <w:spacing w:after="0"/>
         <w:ind w:left="720" w:hanging="720"/>
-        <w:rPr>
-          <w:rFonts w:ascii="Aptos Display" w:hAnsi="Aptos Display"/>
-        </w:rPr>
-      </w:pPr>
-      <w:r>
-        <w:rPr>
-          <w:rFonts w:ascii="Aptos Display" w:hAnsi="Aptos Display"/>
-        </w:rPr>
-        <w:t>VAISHNAVI, V. &amp; KUECHLER, W. 2004. Design research in information systems.</w:t>
+      </w:pPr>
+      <w:r>
+        <w:t xml:space="preserve">WILLIAM, F. K. A. 2024. Interpretivism or constructivism: Navigating research paradigms in social science research. </w:t>
+      </w:r>
+      <w:r>
+        <w:rPr>
+          <w:i/>
+        </w:rPr>
+        <w:t>Interpretivism or Constructivism: Navigating Research Paradigms in Social Science Research,</w:t>
+      </w:r>
+      <w:r>
+        <w:t xml:space="preserve"> 143</w:t>
+      </w:r>
+      <w:r>
+        <w:rPr>
+          <w:b/>
+        </w:rPr>
+        <w:t>,</w:t>
+      </w:r>
+      <w:r>
+        <w:t xml:space="preserve"> 5–5.</w:t>
       </w:r>
     </w:p>
     <w:p>
       <w:pPr>
         <w:pStyle w:val="EndNoteBibliography"/>
-        <w:spacing w:after="0"/>
         <w:ind w:left="720" w:hanging="720"/>
-        <w:rPr>
-          <w:rFonts w:ascii="Aptos Display" w:hAnsi="Aptos Display"/>
-        </w:rPr>
-      </w:pPr>
-      <w:r>
-        <w:rPr>
-          <w:rFonts w:ascii="Aptos Display" w:hAnsi="Aptos Display"/>
-        </w:rPr>
-        <w:t xml:space="preserve">WILLIAM, F. K. A. 2024. Interpretivism or constructivism: Navigating research paradigms in social science research. </w:t>
-      </w:r>
-      <w:r>
-        <w:rPr>
-          <w:rFonts w:ascii="Aptos Display" w:hAnsi="Aptos Display"/>
+      </w:pPr>
+      <w:r>
+        <w:t xml:space="preserve">XU, H., PANG, G., WANG, Y. &amp; WANG, Y. 2023. Deep isolation forest for anomaly detection. </w:t>
+      </w:r>
+      <w:r>
+        <w:rPr>
           <w:i/>
         </w:rPr>
-        <w:t>Interpretivism or Constructivism: Navigating Research Paradigms in Social Science Research,</w:t>
-      </w:r>
-      <w:r>
-        <w:rPr>
-          <w:rFonts w:ascii="Aptos Display" w:hAnsi="Aptos Display"/>
-        </w:rPr>
-        <w:t xml:space="preserve"> 143</w:t>
-      </w:r>
-      <w:r>
-        <w:rPr>
-          <w:rFonts w:ascii="Aptos Display" w:hAnsi="Aptos Display"/>
+        <w:t>IEEE Transactions on Knowledge and Data Engineering,</w:t>
+      </w:r>
+      <w:r>
+        <w:t xml:space="preserve"> 35</w:t>
+      </w:r>
+      <w:r>
+        <w:rPr>
           <w:b/>
         </w:rPr>
         <w:t>,</w:t>
       </w:r>
       <w:r>
-        <w:rPr>
-          <w:rFonts w:ascii="Aptos Display" w:hAnsi="Aptos Display"/>
-        </w:rPr>
-        <w:t xml:space="preserve"> 5–5.</w:t>
-      </w:r>
-    </w:p>
-    <w:p>
-      <w:pPr>
-        <w:pStyle w:val="EndNoteBibliography"/>
-        <w:ind w:left="720" w:hanging="720"/>
-        <w:rPr>
-          <w:rFonts w:ascii="Aptos Display" w:hAnsi="Aptos Display"/>
-        </w:rPr>
-      </w:pPr>
-      <w:r>
-        <w:rPr>
-          <w:rFonts w:ascii="Aptos Display" w:hAnsi="Aptos Display"/>
-        </w:rPr>
-        <w:t xml:space="preserve">XU, H., PANG, G., WANG, Y. &amp; WANG, Y. 2023. Deep isolation forest for anomaly detection. </w:t>
-      </w:r>
-      <w:r>
-        <w:rPr>
-          <w:rFonts w:ascii="Aptos Display" w:hAnsi="Aptos Display"/>
-          <w:i/>
-        </w:rPr>
-        <w:t>IEEE Transactions on Knowledge and Data Engineering,</w:t>
-      </w:r>
-      <w:r>
-        <w:rPr>
-          <w:rFonts w:ascii="Aptos Display" w:hAnsi="Aptos Display"/>
-        </w:rPr>
-        <w:t xml:space="preserve"> 35</w:t>
-      </w:r>
-      <w:r>
-        <w:rPr>
-          <w:rFonts w:ascii="Aptos Display" w:hAnsi="Aptos Display"/>
-          <w:b/>
-        </w:rPr>
-        <w:t>,</w:t>
-      </w:r>
-      <w:r>
-        <w:rPr>
-          <w:rFonts w:ascii="Aptos Display" w:hAnsi="Aptos Display"/>
-        </w:rPr>
         <w:t xml:space="preserve"> 12591–12604.</w:t>
       </w:r>
     </w:p>

</xml_diff>